<commit_message>
Crud de gastos completado
</commit_message>
<xml_diff>
--- a/Documentation/Tomo de Proyecto II borrador.docx
+++ b/Documentation/Tomo de Proyecto II borrador.docx
@@ -137,7 +137,52 @@
           <w:sz w:val="40"/>
           <w:szCs w:val="40"/>
         </w:rPr>
-        <w:t>Desarrollo de un sistema de entorno web para el control administrativo de “New Goal English Academy C.A”</w:t>
+        <w:t xml:space="preserve">Desarrollo de un sistema de entorno web para el control </w:t>
+      </w:r>
+      <w:r>
+        <w:rPr>
+          <w:b/>
+          <w:bCs/>
+          <w:sz w:val="40"/>
+          <w:szCs w:val="40"/>
+        </w:rPr>
+        <w:t>periódico</w:t>
+      </w:r>
+      <w:r>
+        <w:rPr>
+          <w:b/>
+          <w:bCs/>
+          <w:sz w:val="40"/>
+          <w:szCs w:val="40"/>
+        </w:rPr>
+        <w:t xml:space="preserve"> de</w:t>
+      </w:r>
+      <w:r>
+        <w:rPr>
+          <w:b/>
+          <w:bCs/>
+          <w:sz w:val="40"/>
+          <w:szCs w:val="40"/>
+        </w:rPr>
+        <w:t xml:space="preserve"> registro de estudiantes, pagos y gastos en</w:t>
+      </w:r>
+      <w:r>
+        <w:rPr>
+          <w:b/>
+          <w:bCs/>
+          <w:sz w:val="40"/>
+          <w:szCs w:val="40"/>
+        </w:rPr>
+        <w:t xml:space="preserve"> “New Goal English Academy C.A”</w:t>
+      </w:r>
+      <w:r>
+        <w:rPr>
+          <w:b/>
+          <w:bCs/>
+          <w:sz w:val="40"/>
+          <w:szCs w:val="40"/>
+        </w:rPr>
+        <w:t xml:space="preserve">, Cumana, Sucre, Venezuela. Año 2024 </w:t>
       </w:r>
     </w:p>
     <w:bookmarkEnd w:id="0"/>
@@ -529,7 +574,7 @@
           <w:r>
             <w:fldChar w:fldCharType="separate"/>
           </w:r>
-          <w:hyperlink w:anchor="_Toc182761933" w:history="1">
+          <w:hyperlink w:anchor="_Toc184732073" w:history="1">
             <w:r>
               <w:rPr>
                 <w:rStyle w:val="Hipervnculo"/>
@@ -557,7 +602,7 @@
                 <w:noProof/>
                 <w:webHidden/>
               </w:rPr>
-              <w:instrText xml:space="preserve"> PAGEREF _Toc182761933 \h </w:instrText>
+              <w:instrText xml:space="preserve"> PAGEREF _Toc184732073 \h </w:instrText>
             </w:r>
             <w:r>
               <w:rPr>
@@ -602,7 +647,7 @@
               <w14:ligatures w14:val="none"/>
             </w:rPr>
           </w:pPr>
-          <w:hyperlink w:anchor="_Toc182761934" w:history="1">
+          <w:hyperlink w:anchor="_Toc184732074" w:history="1">
             <w:r>
               <w:rPr>
                 <w:rStyle w:val="Hipervnculo"/>
@@ -630,7 +675,7 @@
                 <w:noProof/>
                 <w:webHidden/>
               </w:rPr>
-              <w:instrText xml:space="preserve"> PAGEREF _Toc182761934 \h </w:instrText>
+              <w:instrText xml:space="preserve"> PAGEREF _Toc184732074 \h </w:instrText>
             </w:r>
             <w:r>
               <w:rPr>
@@ -675,7 +720,7 @@
               <w14:ligatures w14:val="none"/>
             </w:rPr>
           </w:pPr>
-          <w:hyperlink w:anchor="_Toc182761935" w:history="1">
+          <w:hyperlink w:anchor="_Toc184732075" w:history="1">
             <w:r>
               <w:rPr>
                 <w:rStyle w:val="Hipervnculo"/>
@@ -703,7 +748,7 @@
                 <w:noProof/>
                 <w:webHidden/>
               </w:rPr>
-              <w:instrText xml:space="preserve"> PAGEREF _Toc182761935 \h </w:instrText>
+              <w:instrText xml:space="preserve"> PAGEREF _Toc184732075 \h </w:instrText>
             </w:r>
             <w:r>
               <w:rPr>
@@ -748,7 +793,7 @@
               <w14:ligatures w14:val="none"/>
             </w:rPr>
           </w:pPr>
-          <w:hyperlink w:anchor="_Toc182761936" w:history="1">
+          <w:hyperlink w:anchor="_Toc184732076" w:history="1">
             <w:r>
               <w:rPr>
                 <w:rStyle w:val="Hipervnculo"/>
@@ -775,7 +820,7 @@
                 <w:noProof/>
                 <w:webHidden/>
               </w:rPr>
-              <w:instrText xml:space="preserve"> PAGEREF _Toc182761936 \h </w:instrText>
+              <w:instrText xml:space="preserve"> PAGEREF _Toc184732076 \h </w:instrText>
             </w:r>
             <w:r>
               <w:rPr>
@@ -820,7 +865,7 @@
               <w14:ligatures w14:val="none"/>
             </w:rPr>
           </w:pPr>
-          <w:hyperlink w:anchor="_Toc182761937" w:history="1">
+          <w:hyperlink w:anchor="_Toc184732077" w:history="1">
             <w:r>
               <w:rPr>
                 <w:rStyle w:val="Hipervnculo"/>
@@ -847,7 +892,7 @@
                 <w:noProof/>
                 <w:webHidden/>
               </w:rPr>
-              <w:instrText xml:space="preserve"> PAGEREF _Toc182761937 \h </w:instrText>
+              <w:instrText xml:space="preserve"> PAGEREF _Toc184732077 \h </w:instrText>
             </w:r>
             <w:r>
               <w:rPr>
@@ -892,7 +937,7 @@
               <w14:ligatures w14:val="none"/>
             </w:rPr>
           </w:pPr>
-          <w:hyperlink w:anchor="_Toc182761938" w:history="1">
+          <w:hyperlink w:anchor="_Toc184732078" w:history="1">
             <w:r>
               <w:rPr>
                 <w:rStyle w:val="Hipervnculo"/>
@@ -919,7 +964,7 @@
                 <w:noProof/>
                 <w:webHidden/>
               </w:rPr>
-              <w:instrText xml:space="preserve"> PAGEREF _Toc182761938 \h </w:instrText>
+              <w:instrText xml:space="preserve"> PAGEREF _Toc184732078 \h </w:instrText>
             </w:r>
             <w:r>
               <w:rPr>
@@ -964,7 +1009,7 @@
               <w14:ligatures w14:val="none"/>
             </w:rPr>
           </w:pPr>
-          <w:hyperlink w:anchor="_Toc182761939" w:history="1">
+          <w:hyperlink w:anchor="_Toc184732079" w:history="1">
             <w:r>
               <w:rPr>
                 <w:rStyle w:val="Hipervnculo"/>
@@ -991,7 +1036,7 @@
                 <w:noProof/>
                 <w:webHidden/>
               </w:rPr>
-              <w:instrText xml:space="preserve"> PAGEREF _Toc182761939 \h </w:instrText>
+              <w:instrText xml:space="preserve"> PAGEREF _Toc184732079 \h </w:instrText>
             </w:r>
             <w:r>
               <w:rPr>
@@ -1036,7 +1081,7 @@
               <w14:ligatures w14:val="none"/>
             </w:rPr>
           </w:pPr>
-          <w:hyperlink w:anchor="_Toc182761940" w:history="1">
+          <w:hyperlink w:anchor="_Toc184732080" w:history="1">
             <w:r>
               <w:rPr>
                 <w:rStyle w:val="Hipervnculo"/>
@@ -1063,7 +1108,7 @@
                 <w:noProof/>
                 <w:webHidden/>
               </w:rPr>
-              <w:instrText xml:space="preserve"> PAGEREF _Toc182761940 \h </w:instrText>
+              <w:instrText xml:space="preserve"> PAGEREF _Toc184732080 \h </w:instrText>
             </w:r>
             <w:r>
               <w:rPr>
@@ -1108,7 +1153,7 @@
               <w14:ligatures w14:val="none"/>
             </w:rPr>
           </w:pPr>
-          <w:hyperlink w:anchor="_Toc182761941" w:history="1">
+          <w:hyperlink w:anchor="_Toc184732081" w:history="1">
             <w:r>
               <w:rPr>
                 <w:rStyle w:val="Hipervnculo"/>
@@ -1135,7 +1180,7 @@
                 <w:noProof/>
                 <w:webHidden/>
               </w:rPr>
-              <w:instrText xml:space="preserve"> PAGEREF _Toc182761941 \h </w:instrText>
+              <w:instrText xml:space="preserve"> PAGEREF _Toc184732081 \h </w:instrText>
             </w:r>
             <w:r>
               <w:rPr>
@@ -1180,7 +1225,7 @@
               <w14:ligatures w14:val="none"/>
             </w:rPr>
           </w:pPr>
-          <w:hyperlink w:anchor="_Toc182761942" w:history="1">
+          <w:hyperlink w:anchor="_Toc184732082" w:history="1">
             <w:r>
               <w:rPr>
                 <w:rStyle w:val="Hipervnculo"/>
@@ -1207,7 +1252,7 @@
                 <w:noProof/>
                 <w:webHidden/>
               </w:rPr>
-              <w:instrText xml:space="preserve"> PAGEREF _Toc182761942 \h </w:instrText>
+              <w:instrText xml:space="preserve"> PAGEREF _Toc184732082 \h </w:instrText>
             </w:r>
             <w:r>
               <w:rPr>
@@ -1252,7 +1297,7 @@
               <w14:ligatures w14:val="none"/>
             </w:rPr>
           </w:pPr>
-          <w:hyperlink w:anchor="_Toc182761943" w:history="1">
+          <w:hyperlink w:anchor="_Toc184732083" w:history="1">
             <w:r>
               <w:rPr>
                 <w:rStyle w:val="Hipervnculo"/>
@@ -1281,7 +1326,7 @@
                 <w:noProof/>
                 <w:webHidden/>
               </w:rPr>
-              <w:instrText xml:space="preserve"> PAGEREF _Toc182761943 \h </w:instrText>
+              <w:instrText xml:space="preserve"> PAGEREF _Toc184732083 \h </w:instrText>
             </w:r>
             <w:r>
               <w:rPr>
@@ -1326,7 +1371,7 @@
               <w14:ligatures w14:val="none"/>
             </w:rPr>
           </w:pPr>
-          <w:hyperlink w:anchor="_Toc182761944" w:history="1">
+          <w:hyperlink w:anchor="_Toc184732084" w:history="1">
             <w:r>
               <w:rPr>
                 <w:rStyle w:val="Hipervnculo"/>
@@ -1354,7 +1399,7 @@
                 <w:noProof/>
                 <w:webHidden/>
               </w:rPr>
-              <w:instrText xml:space="preserve"> PAGEREF _Toc182761944 \h </w:instrText>
+              <w:instrText xml:space="preserve"> PAGEREF _Toc184732084 \h </w:instrText>
             </w:r>
             <w:r>
               <w:rPr>
@@ -1399,7 +1444,7 @@
               <w14:ligatures w14:val="none"/>
             </w:rPr>
           </w:pPr>
-          <w:hyperlink w:anchor="_Toc182761945" w:history="1">
+          <w:hyperlink w:anchor="_Toc184732085" w:history="1">
             <w:r>
               <w:rPr>
                 <w:rStyle w:val="Hipervnculo"/>
@@ -1427,7 +1472,7 @@
                 <w:noProof/>
                 <w:webHidden/>
               </w:rPr>
-              <w:instrText xml:space="preserve"> PAGEREF _Toc182761945 \h </w:instrText>
+              <w:instrText xml:space="preserve"> PAGEREF _Toc184732085 \h </w:instrText>
             </w:r>
             <w:r>
               <w:rPr>
@@ -1472,7 +1517,7 @@
               <w14:ligatures w14:val="none"/>
             </w:rPr>
           </w:pPr>
-          <w:hyperlink w:anchor="_Toc182761946" w:history="1">
+          <w:hyperlink w:anchor="_Toc184732086" w:history="1">
             <w:r>
               <w:rPr>
                 <w:rStyle w:val="Hipervnculo"/>
@@ -1501,7 +1546,7 @@
                 <w:noProof/>
                 <w:webHidden/>
               </w:rPr>
-              <w:instrText xml:space="preserve"> PAGEREF _Toc182761946 \h </w:instrText>
+              <w:instrText xml:space="preserve"> PAGEREF _Toc184732086 \h </w:instrText>
             </w:r>
             <w:r>
               <w:rPr>
@@ -1546,7 +1591,7 @@
               <w14:ligatures w14:val="none"/>
             </w:rPr>
           </w:pPr>
-          <w:hyperlink w:anchor="_Toc182761947" w:history="1">
+          <w:hyperlink w:anchor="_Toc184732087" w:history="1">
             <w:r>
               <w:rPr>
                 <w:rStyle w:val="Hipervnculo"/>
@@ -1574,7 +1619,7 @@
                 <w:noProof/>
                 <w:webHidden/>
               </w:rPr>
-              <w:instrText xml:space="preserve"> PAGEREF _Toc182761947 \h </w:instrText>
+              <w:instrText xml:space="preserve"> PAGEREF _Toc184732087 \h </w:instrText>
             </w:r>
             <w:r>
               <w:rPr>
@@ -1619,7 +1664,7 @@
               <w14:ligatures w14:val="none"/>
             </w:rPr>
           </w:pPr>
-          <w:hyperlink w:anchor="_Toc182761948" w:history="1">
+          <w:hyperlink w:anchor="_Toc184732088" w:history="1">
             <w:r>
               <w:rPr>
                 <w:rStyle w:val="Hipervnculo"/>
@@ -1646,7 +1691,7 @@
                 <w:noProof/>
                 <w:webHidden/>
               </w:rPr>
-              <w:instrText xml:space="preserve"> PAGEREF _Toc182761948 \h </w:instrText>
+              <w:instrText xml:space="preserve"> PAGEREF _Toc184732088 \h </w:instrText>
             </w:r>
             <w:r>
               <w:rPr>
@@ -1691,7 +1736,7 @@
               <w14:ligatures w14:val="none"/>
             </w:rPr>
           </w:pPr>
-          <w:hyperlink w:anchor="_Toc182761949" w:history="1">
+          <w:hyperlink w:anchor="_Toc184732089" w:history="1">
             <w:r>
               <w:rPr>
                 <w:rStyle w:val="Hipervnculo"/>
@@ -1718,7 +1763,7 @@
                 <w:noProof/>
                 <w:webHidden/>
               </w:rPr>
-              <w:instrText xml:space="preserve"> PAGEREF _Toc182761949 \h </w:instrText>
+              <w:instrText xml:space="preserve"> PAGEREF _Toc184732089 \h </w:instrText>
             </w:r>
             <w:r>
               <w:rPr>
@@ -1763,7 +1808,7 @@
               <w14:ligatures w14:val="none"/>
             </w:rPr>
           </w:pPr>
-          <w:hyperlink w:anchor="_Toc182761950" w:history="1">
+          <w:hyperlink w:anchor="_Toc184732090" w:history="1">
             <w:r>
               <w:rPr>
                 <w:rStyle w:val="Hipervnculo"/>
@@ -1790,7 +1835,7 @@
                 <w:noProof/>
                 <w:webHidden/>
               </w:rPr>
-              <w:instrText xml:space="preserve"> PAGEREF _Toc182761950 \h </w:instrText>
+              <w:instrText xml:space="preserve"> PAGEREF _Toc184732090 \h </w:instrText>
             </w:r>
             <w:r>
               <w:rPr>
@@ -1835,7 +1880,7 @@
               <w14:ligatures w14:val="none"/>
             </w:rPr>
           </w:pPr>
-          <w:hyperlink w:anchor="_Toc182761951" w:history="1">
+          <w:hyperlink w:anchor="_Toc184732091" w:history="1">
             <w:r>
               <w:rPr>
                 <w:rStyle w:val="Hipervnculo"/>
@@ -1862,7 +1907,7 @@
                 <w:noProof/>
                 <w:webHidden/>
               </w:rPr>
-              <w:instrText xml:space="preserve"> PAGEREF _Toc182761951 \h </w:instrText>
+              <w:instrText xml:space="preserve"> PAGEREF _Toc184732091 \h </w:instrText>
             </w:r>
             <w:r>
               <w:rPr>
@@ -1907,7 +1952,7 @@
               <w14:ligatures w14:val="none"/>
             </w:rPr>
           </w:pPr>
-          <w:hyperlink w:anchor="_Toc182761952" w:history="1">
+          <w:hyperlink w:anchor="_Toc184732092" w:history="1">
             <w:r>
               <w:rPr>
                 <w:rStyle w:val="Hipervnculo"/>
@@ -1934,7 +1979,7 @@
                 <w:noProof/>
                 <w:webHidden/>
               </w:rPr>
-              <w:instrText xml:space="preserve"> PAGEREF _Toc182761952 \h </w:instrText>
+              <w:instrText xml:space="preserve"> PAGEREF _Toc184732092 \h </w:instrText>
             </w:r>
             <w:r>
               <w:rPr>
@@ -1979,7 +2024,7 @@
               <w14:ligatures w14:val="none"/>
             </w:rPr>
           </w:pPr>
-          <w:hyperlink w:anchor="_Toc182761953" w:history="1">
+          <w:hyperlink w:anchor="_Toc184732093" w:history="1">
             <w:r>
               <w:rPr>
                 <w:rStyle w:val="Hipervnculo"/>
@@ -2006,7 +2051,7 @@
                 <w:noProof/>
                 <w:webHidden/>
               </w:rPr>
-              <w:instrText xml:space="preserve"> PAGEREF _Toc182761953 \h </w:instrText>
+              <w:instrText xml:space="preserve"> PAGEREF _Toc184732093 \h </w:instrText>
             </w:r>
             <w:r>
               <w:rPr>
@@ -2051,7 +2096,7 @@
               <w14:ligatures w14:val="none"/>
             </w:rPr>
           </w:pPr>
-          <w:hyperlink w:anchor="_Toc182761954" w:history="1">
+          <w:hyperlink w:anchor="_Toc184732094" w:history="1">
             <w:r>
               <w:rPr>
                 <w:rStyle w:val="Hipervnculo"/>
@@ -2078,7 +2123,7 @@
                 <w:noProof/>
                 <w:webHidden/>
               </w:rPr>
-              <w:instrText xml:space="preserve"> PAGEREF _Toc182761954 \h </w:instrText>
+              <w:instrText xml:space="preserve"> PAGEREF _Toc184732094 \h </w:instrText>
             </w:r>
             <w:r>
               <w:rPr>
@@ -2098,7 +2143,7 @@
                 <w:noProof/>
                 <w:webHidden/>
               </w:rPr>
-              <w:t>22</w:t>
+              <w:t>23</w:t>
             </w:r>
             <w:r>
               <w:rPr>
@@ -2123,7 +2168,7 @@
               <w14:ligatures w14:val="none"/>
             </w:rPr>
           </w:pPr>
-          <w:hyperlink w:anchor="_Toc182761955" w:history="1">
+          <w:hyperlink w:anchor="_Toc184732095" w:history="1">
             <w:r>
               <w:rPr>
                 <w:rStyle w:val="Hipervnculo"/>
@@ -2150,7 +2195,7 @@
                 <w:noProof/>
                 <w:webHidden/>
               </w:rPr>
-              <w:instrText xml:space="preserve"> PAGEREF _Toc182761955 \h </w:instrText>
+              <w:instrText xml:space="preserve"> PAGEREF _Toc184732095 \h </w:instrText>
             </w:r>
             <w:r>
               <w:rPr>
@@ -2170,7 +2215,7 @@
                 <w:noProof/>
                 <w:webHidden/>
               </w:rPr>
-              <w:t>24</w:t>
+              <w:t>25</w:t>
             </w:r>
             <w:r>
               <w:rPr>
@@ -2195,13 +2240,13 @@
               <w14:ligatures w14:val="none"/>
             </w:rPr>
           </w:pPr>
-          <w:hyperlink w:anchor="_Toc182761956" w:history="1">
+          <w:hyperlink w:anchor="_Toc184732096" w:history="1">
             <w:r>
               <w:rPr>
                 <w:rStyle w:val="Hipervnculo"/>
                 <w:noProof/>
               </w:rPr>
-              <w:t>1.22 Estudio de Factibilidad</w:t>
+              <w:t>1.21 Estudio de Factibilidad</w:t>
             </w:r>
             <w:r>
               <w:rPr>
@@ -2222,7 +2267,7 @@
                 <w:noProof/>
                 <w:webHidden/>
               </w:rPr>
-              <w:instrText xml:space="preserve"> PAGEREF _Toc182761956 \h </w:instrText>
+              <w:instrText xml:space="preserve"> PAGEREF _Toc184732096 \h </w:instrText>
             </w:r>
             <w:r>
               <w:rPr>
@@ -2267,7 +2312,7 @@
               <w14:ligatures w14:val="none"/>
             </w:rPr>
           </w:pPr>
-          <w:hyperlink w:anchor="_Toc182761957" w:history="1">
+          <w:hyperlink w:anchor="_Toc184732097" w:history="1">
             <w:r>
               <w:rPr>
                 <w:rStyle w:val="Hipervnculo"/>
@@ -2294,7 +2339,7 @@
                 <w:noProof/>
                 <w:webHidden/>
               </w:rPr>
-              <w:instrText xml:space="preserve"> PAGEREF _Toc182761957 \h </w:instrText>
+              <w:instrText xml:space="preserve"> PAGEREF _Toc184732097 \h </w:instrText>
             </w:r>
             <w:r>
               <w:rPr>
@@ -2314,7 +2359,7 @@
                 <w:noProof/>
                 <w:webHidden/>
               </w:rPr>
-              <w:t>29</w:t>
+              <w:t>31</w:t>
             </w:r>
             <w:r>
               <w:rPr>
@@ -2339,7 +2384,7 @@
               <w14:ligatures w14:val="none"/>
             </w:rPr>
           </w:pPr>
-          <w:hyperlink w:anchor="_Toc182761958" w:history="1">
+          <w:hyperlink w:anchor="_Toc184732098" w:history="1">
             <w:r>
               <w:rPr>
                 <w:rStyle w:val="Hipervnculo"/>
@@ -2366,7 +2411,7 @@
                 <w:noProof/>
                 <w:webHidden/>
               </w:rPr>
-              <w:instrText xml:space="preserve"> PAGEREF _Toc182761958 \h </w:instrText>
+              <w:instrText xml:space="preserve"> PAGEREF _Toc184732098 \h </w:instrText>
             </w:r>
             <w:r>
               <w:rPr>
@@ -2386,7 +2431,79 @@
                 <w:noProof/>
                 <w:webHidden/>
               </w:rPr>
-              <w:t>30</w:t>
+              <w:t>33</w:t>
+            </w:r>
+            <w:r>
+              <w:rPr>
+                <w:noProof/>
+                <w:webHidden/>
+              </w:rPr>
+              <w:fldChar w:fldCharType="end"/>
+            </w:r>
+          </w:hyperlink>
+        </w:p>
+        <w:p>
+          <w:pPr>
+            <w:pStyle w:val="TDC1"/>
+            <w:tabs>
+              <w:tab w:val="right" w:leader="dot" w:pos="9350"/>
+            </w:tabs>
+            <w:rPr>
+              <w:rFonts w:eastAsiaTheme="minorEastAsia"/>
+              <w:noProof/>
+              <w:kern w:val="0"/>
+              <w:lang w:eastAsia="es-VE"/>
+              <w14:ligatures w14:val="none"/>
+            </w:rPr>
+          </w:pPr>
+          <w:hyperlink w:anchor="_Toc184732099" w:history="1">
+            <w:r>
+              <w:rPr>
+                <w:rStyle w:val="Hipervnculo"/>
+                <w:noProof/>
+              </w:rPr>
+              <w:t>Marco Teórico</w:t>
+            </w:r>
+            <w:r>
+              <w:rPr>
+                <w:noProof/>
+                <w:webHidden/>
+              </w:rPr>
+              <w:tab/>
+            </w:r>
+            <w:r>
+              <w:rPr>
+                <w:noProof/>
+                <w:webHidden/>
+              </w:rPr>
+              <w:fldChar w:fldCharType="begin"/>
+            </w:r>
+            <w:r>
+              <w:rPr>
+                <w:noProof/>
+                <w:webHidden/>
+              </w:rPr>
+              <w:instrText xml:space="preserve"> PAGEREF _Toc184732099 \h </w:instrText>
+            </w:r>
+            <w:r>
+              <w:rPr>
+                <w:noProof/>
+                <w:webHidden/>
+              </w:rPr>
+            </w:r>
+            <w:r>
+              <w:rPr>
+                <w:noProof/>
+                <w:webHidden/>
+              </w:rPr>
+              <w:fldChar w:fldCharType="separate"/>
+            </w:r>
+            <w:r>
+              <w:rPr>
+                <w:noProof/>
+                <w:webHidden/>
+              </w:rPr>
+              <w:t>33</w:t>
             </w:r>
             <w:r>
               <w:rPr>
@@ -2411,13 +2528,13 @@
               <w14:ligatures w14:val="none"/>
             </w:rPr>
           </w:pPr>
-          <w:hyperlink w:anchor="_Toc182761959" w:history="1">
+          <w:hyperlink w:anchor="_Toc184732100" w:history="1">
             <w:r>
               <w:rPr>
                 <w:rStyle w:val="Hipervnculo"/>
                 <w:noProof/>
               </w:rPr>
-              <w:t>2.1 Bases Teóricas</w:t>
+              <w:t>2.1 Antecedentes de la investigación</w:t>
             </w:r>
             <w:r>
               <w:rPr>
@@ -2438,7 +2555,7 @@
                 <w:noProof/>
                 <w:webHidden/>
               </w:rPr>
-              <w:instrText xml:space="preserve"> PAGEREF _Toc182761959 \h </w:instrText>
+              <w:instrText xml:space="preserve"> PAGEREF _Toc184732100 \h </w:instrText>
             </w:r>
             <w:r>
               <w:rPr>
@@ -2458,7 +2575,7 @@
                 <w:noProof/>
                 <w:webHidden/>
               </w:rPr>
-              <w:t>30</w:t>
+              <w:t>33</w:t>
             </w:r>
             <w:r>
               <w:rPr>
@@ -2483,13 +2600,13 @@
               <w14:ligatures w14:val="none"/>
             </w:rPr>
           </w:pPr>
-          <w:hyperlink w:anchor="_Toc182761960" w:history="1">
+          <w:hyperlink w:anchor="_Toc184732101" w:history="1">
             <w:r>
               <w:rPr>
                 <w:rStyle w:val="Hipervnculo"/>
                 <w:noProof/>
               </w:rPr>
-              <w:t>2.2 Bases Legales</w:t>
+              <w:t>2.2 Bases Teóricas</w:t>
             </w:r>
             <w:r>
               <w:rPr>
@@ -2510,7 +2627,7 @@
                 <w:noProof/>
                 <w:webHidden/>
               </w:rPr>
-              <w:instrText xml:space="preserve"> PAGEREF _Toc182761960 \h </w:instrText>
+              <w:instrText xml:space="preserve"> PAGEREF _Toc184732101 \h </w:instrText>
             </w:r>
             <w:r>
               <w:rPr>
@@ -2530,7 +2647,421 @@
                 <w:noProof/>
                 <w:webHidden/>
               </w:rPr>
-              <w:t>30</w:t>
+              <w:t>36</w:t>
+            </w:r>
+            <w:r>
+              <w:rPr>
+                <w:noProof/>
+                <w:webHidden/>
+              </w:rPr>
+              <w:fldChar w:fldCharType="end"/>
+            </w:r>
+          </w:hyperlink>
+        </w:p>
+        <w:p>
+          <w:pPr>
+            <w:pStyle w:val="TDC3"/>
+            <w:tabs>
+              <w:tab w:val="right" w:leader="dot" w:pos="9350"/>
+            </w:tabs>
+            <w:rPr>
+              <w:rFonts w:cstheme="minorBidi"/>
+              <w:noProof/>
+            </w:rPr>
+          </w:pPr>
+          <w:hyperlink w:anchor="_Toc184732102" w:history="1">
+            <w:r>
+              <w:rPr>
+                <w:rStyle w:val="Hipervnculo"/>
+                <w:noProof/>
+              </w:rPr>
+              <w:t>Tecnologías Empleadas</w:t>
+            </w:r>
+            <w:r>
+              <w:rPr>
+                <w:noProof/>
+                <w:webHidden/>
+              </w:rPr>
+              <w:tab/>
+            </w:r>
+            <w:r>
+              <w:rPr>
+                <w:noProof/>
+                <w:webHidden/>
+              </w:rPr>
+              <w:fldChar w:fldCharType="begin"/>
+            </w:r>
+            <w:r>
+              <w:rPr>
+                <w:noProof/>
+                <w:webHidden/>
+              </w:rPr>
+              <w:instrText xml:space="preserve"> PAGEREF _Toc184732102 \h </w:instrText>
+            </w:r>
+            <w:r>
+              <w:rPr>
+                <w:noProof/>
+                <w:webHidden/>
+              </w:rPr>
+            </w:r>
+            <w:r>
+              <w:rPr>
+                <w:noProof/>
+                <w:webHidden/>
+              </w:rPr>
+              <w:fldChar w:fldCharType="separate"/>
+            </w:r>
+            <w:r>
+              <w:rPr>
+                <w:noProof/>
+                <w:webHidden/>
+              </w:rPr>
+              <w:t>40</w:t>
+            </w:r>
+            <w:r>
+              <w:rPr>
+                <w:noProof/>
+                <w:webHidden/>
+              </w:rPr>
+              <w:fldChar w:fldCharType="end"/>
+            </w:r>
+          </w:hyperlink>
+        </w:p>
+        <w:p>
+          <w:pPr>
+            <w:pStyle w:val="TDC3"/>
+            <w:tabs>
+              <w:tab w:val="right" w:leader="dot" w:pos="9350"/>
+            </w:tabs>
+            <w:rPr>
+              <w:rFonts w:cstheme="minorBidi"/>
+              <w:noProof/>
+            </w:rPr>
+          </w:pPr>
+          <w:hyperlink w:anchor="_Toc184732103" w:history="1">
+            <w:r>
+              <w:rPr>
+                <w:rStyle w:val="Hipervnculo"/>
+                <w:noProof/>
+              </w:rPr>
+              <w:t>JavaScript: El Lenguaje Versátil de la Web Moderna</w:t>
+            </w:r>
+            <w:r>
+              <w:rPr>
+                <w:noProof/>
+                <w:webHidden/>
+              </w:rPr>
+              <w:tab/>
+            </w:r>
+            <w:r>
+              <w:rPr>
+                <w:noProof/>
+                <w:webHidden/>
+              </w:rPr>
+              <w:fldChar w:fldCharType="begin"/>
+            </w:r>
+            <w:r>
+              <w:rPr>
+                <w:noProof/>
+                <w:webHidden/>
+              </w:rPr>
+              <w:instrText xml:space="preserve"> PAGEREF _Toc184732103 \h </w:instrText>
+            </w:r>
+            <w:r>
+              <w:rPr>
+                <w:noProof/>
+                <w:webHidden/>
+              </w:rPr>
+            </w:r>
+            <w:r>
+              <w:rPr>
+                <w:noProof/>
+                <w:webHidden/>
+              </w:rPr>
+              <w:fldChar w:fldCharType="separate"/>
+            </w:r>
+            <w:r>
+              <w:rPr>
+                <w:noProof/>
+                <w:webHidden/>
+              </w:rPr>
+              <w:t>40</w:t>
+            </w:r>
+            <w:r>
+              <w:rPr>
+                <w:noProof/>
+                <w:webHidden/>
+              </w:rPr>
+              <w:fldChar w:fldCharType="end"/>
+            </w:r>
+          </w:hyperlink>
+        </w:p>
+        <w:p>
+          <w:pPr>
+            <w:pStyle w:val="TDC3"/>
+            <w:tabs>
+              <w:tab w:val="right" w:leader="dot" w:pos="9350"/>
+            </w:tabs>
+            <w:rPr>
+              <w:rFonts w:cstheme="minorBidi"/>
+              <w:noProof/>
+            </w:rPr>
+          </w:pPr>
+          <w:hyperlink w:anchor="_Toc184732104" w:history="1">
+            <w:r>
+              <w:rPr>
+                <w:rStyle w:val="Hipervnculo"/>
+                <w:noProof/>
+              </w:rPr>
+              <w:t>PostgreSQL</w:t>
+            </w:r>
+            <w:r>
+              <w:rPr>
+                <w:noProof/>
+                <w:webHidden/>
+              </w:rPr>
+              <w:tab/>
+            </w:r>
+            <w:r>
+              <w:rPr>
+                <w:noProof/>
+                <w:webHidden/>
+              </w:rPr>
+              <w:fldChar w:fldCharType="begin"/>
+            </w:r>
+            <w:r>
+              <w:rPr>
+                <w:noProof/>
+                <w:webHidden/>
+              </w:rPr>
+              <w:instrText xml:space="preserve"> PAGEREF _Toc184732104 \h </w:instrText>
+            </w:r>
+            <w:r>
+              <w:rPr>
+                <w:noProof/>
+                <w:webHidden/>
+              </w:rPr>
+            </w:r>
+            <w:r>
+              <w:rPr>
+                <w:noProof/>
+                <w:webHidden/>
+              </w:rPr>
+              <w:fldChar w:fldCharType="separate"/>
+            </w:r>
+            <w:r>
+              <w:rPr>
+                <w:noProof/>
+                <w:webHidden/>
+              </w:rPr>
+              <w:t>41</w:t>
+            </w:r>
+            <w:r>
+              <w:rPr>
+                <w:noProof/>
+                <w:webHidden/>
+              </w:rPr>
+              <w:fldChar w:fldCharType="end"/>
+            </w:r>
+          </w:hyperlink>
+        </w:p>
+        <w:p>
+          <w:pPr>
+            <w:pStyle w:val="TDC3"/>
+            <w:tabs>
+              <w:tab w:val="right" w:leader="dot" w:pos="9350"/>
+            </w:tabs>
+            <w:rPr>
+              <w:rFonts w:cstheme="minorBidi"/>
+              <w:noProof/>
+            </w:rPr>
+          </w:pPr>
+          <w:hyperlink w:anchor="_Toc184732105" w:history="1">
+            <w:r>
+              <w:rPr>
+                <w:rStyle w:val="Hipervnculo"/>
+                <w:noProof/>
+              </w:rPr>
+              <w:t>Node.js</w:t>
+            </w:r>
+            <w:r>
+              <w:rPr>
+                <w:noProof/>
+                <w:webHidden/>
+              </w:rPr>
+              <w:tab/>
+            </w:r>
+            <w:r>
+              <w:rPr>
+                <w:noProof/>
+                <w:webHidden/>
+              </w:rPr>
+              <w:fldChar w:fldCharType="begin"/>
+            </w:r>
+            <w:r>
+              <w:rPr>
+                <w:noProof/>
+                <w:webHidden/>
+              </w:rPr>
+              <w:instrText xml:space="preserve"> PAGEREF _Toc184732105 \h </w:instrText>
+            </w:r>
+            <w:r>
+              <w:rPr>
+                <w:noProof/>
+                <w:webHidden/>
+              </w:rPr>
+            </w:r>
+            <w:r>
+              <w:rPr>
+                <w:noProof/>
+                <w:webHidden/>
+              </w:rPr>
+              <w:fldChar w:fldCharType="separate"/>
+            </w:r>
+            <w:r>
+              <w:rPr>
+                <w:noProof/>
+                <w:webHidden/>
+              </w:rPr>
+              <w:t>44</w:t>
+            </w:r>
+            <w:r>
+              <w:rPr>
+                <w:noProof/>
+                <w:webHidden/>
+              </w:rPr>
+              <w:fldChar w:fldCharType="end"/>
+            </w:r>
+          </w:hyperlink>
+        </w:p>
+        <w:p>
+          <w:pPr>
+            <w:pStyle w:val="TDC3"/>
+            <w:tabs>
+              <w:tab w:val="right" w:leader="dot" w:pos="9350"/>
+            </w:tabs>
+            <w:rPr>
+              <w:rFonts w:cstheme="minorBidi"/>
+              <w:noProof/>
+            </w:rPr>
+          </w:pPr>
+          <w:hyperlink w:anchor="_Toc184732106" w:history="1">
+            <w:r>
+              <w:rPr>
+                <w:rStyle w:val="Hipervnculo"/>
+                <w:noProof/>
+              </w:rPr>
+              <w:t>Vue.js</w:t>
+            </w:r>
+            <w:r>
+              <w:rPr>
+                <w:noProof/>
+                <w:webHidden/>
+              </w:rPr>
+              <w:tab/>
+            </w:r>
+            <w:r>
+              <w:rPr>
+                <w:noProof/>
+                <w:webHidden/>
+              </w:rPr>
+              <w:fldChar w:fldCharType="begin"/>
+            </w:r>
+            <w:r>
+              <w:rPr>
+                <w:noProof/>
+                <w:webHidden/>
+              </w:rPr>
+              <w:instrText xml:space="preserve"> PAGEREF _Toc184732106 \h </w:instrText>
+            </w:r>
+            <w:r>
+              <w:rPr>
+                <w:noProof/>
+                <w:webHidden/>
+              </w:rPr>
+            </w:r>
+            <w:r>
+              <w:rPr>
+                <w:noProof/>
+                <w:webHidden/>
+              </w:rPr>
+              <w:fldChar w:fldCharType="separate"/>
+            </w:r>
+            <w:r>
+              <w:rPr>
+                <w:noProof/>
+                <w:webHidden/>
+              </w:rPr>
+              <w:t>45</w:t>
+            </w:r>
+            <w:r>
+              <w:rPr>
+                <w:noProof/>
+                <w:webHidden/>
+              </w:rPr>
+              <w:fldChar w:fldCharType="end"/>
+            </w:r>
+          </w:hyperlink>
+        </w:p>
+        <w:p>
+          <w:pPr>
+            <w:pStyle w:val="TDC3"/>
+            <w:tabs>
+              <w:tab w:val="right" w:leader="dot" w:pos="9350"/>
+            </w:tabs>
+            <w:rPr>
+              <w:rFonts w:cstheme="minorBidi"/>
+              <w:noProof/>
+            </w:rPr>
+          </w:pPr>
+          <w:hyperlink w:anchor="_Toc184732107" w:history="1">
+            <w:r>
+              <w:rPr>
+                <w:rStyle w:val="Hipervnculo"/>
+                <w:noProof/>
+              </w:rPr>
+              <w:t>Vuetify.js</w:t>
+            </w:r>
+            <w:r>
+              <w:rPr>
+                <w:noProof/>
+                <w:webHidden/>
+              </w:rPr>
+              <w:tab/>
+            </w:r>
+            <w:r>
+              <w:rPr>
+                <w:noProof/>
+                <w:webHidden/>
+              </w:rPr>
+              <w:fldChar w:fldCharType="begin"/>
+            </w:r>
+            <w:r>
+              <w:rPr>
+                <w:noProof/>
+                <w:webHidden/>
+              </w:rPr>
+              <w:instrText xml:space="preserve"> PAGEREF _Toc184732107 \h </w:instrText>
+            </w:r>
+            <w:r>
+              <w:rPr>
+                <w:noProof/>
+                <w:webHidden/>
+              </w:rPr>
+            </w:r>
+            <w:r>
+              <w:rPr>
+                <w:noProof/>
+                <w:webHidden/>
+              </w:rPr>
+              <w:fldChar w:fldCharType="separate"/>
+            </w:r>
+            <w:r>
+              <w:rPr>
+                <w:noProof/>
+                <w:webHidden/>
+              </w:rPr>
+              <w:t>47</w:t>
             </w:r>
             <w:r>
               <w:rPr>
@@ -2555,13 +3086,13 @@
               <w14:ligatures w14:val="none"/>
             </w:rPr>
           </w:pPr>
-          <w:hyperlink w:anchor="_Toc182761961" w:history="1">
+          <w:hyperlink w:anchor="_Toc184732108" w:history="1">
             <w:r>
               <w:rPr>
                 <w:rStyle w:val="Hipervnculo"/>
                 <w:noProof/>
               </w:rPr>
-              <w:t>2.3 Constitución de la república bolivariana de Venezuela (1999)</w:t>
+              <w:t>2.3 Bases Legales</w:t>
             </w:r>
             <w:r>
               <w:rPr>
@@ -2582,7 +3113,7 @@
                 <w:noProof/>
                 <w:webHidden/>
               </w:rPr>
-              <w:instrText xml:space="preserve"> PAGEREF _Toc182761961 \h </w:instrText>
+              <w:instrText xml:space="preserve"> PAGEREF _Toc184732108 \h </w:instrText>
             </w:r>
             <w:r>
               <w:rPr>
@@ -2602,7 +3133,289 @@
                 <w:noProof/>
                 <w:webHidden/>
               </w:rPr>
-              <w:t>30</w:t>
+              <w:t>51</w:t>
+            </w:r>
+            <w:r>
+              <w:rPr>
+                <w:noProof/>
+                <w:webHidden/>
+              </w:rPr>
+              <w:fldChar w:fldCharType="end"/>
+            </w:r>
+          </w:hyperlink>
+        </w:p>
+        <w:p>
+          <w:pPr>
+            <w:pStyle w:val="TDC3"/>
+            <w:tabs>
+              <w:tab w:val="right" w:leader="dot" w:pos="9350"/>
+            </w:tabs>
+            <w:rPr>
+              <w:rFonts w:cstheme="minorBidi"/>
+              <w:noProof/>
+            </w:rPr>
+          </w:pPr>
+          <w:hyperlink w:anchor="_Toc184732109" w:history="1">
+            <w:r>
+              <w:rPr>
+                <w:rStyle w:val="Hipervnculo"/>
+                <w:noProof/>
+              </w:rPr>
+              <w:t>Constitución de la república bolivariana de Venezuela (1999)</w:t>
+            </w:r>
+            <w:r>
+              <w:rPr>
+                <w:noProof/>
+                <w:webHidden/>
+              </w:rPr>
+              <w:tab/>
+            </w:r>
+            <w:r>
+              <w:rPr>
+                <w:noProof/>
+                <w:webHidden/>
+              </w:rPr>
+              <w:fldChar w:fldCharType="begin"/>
+            </w:r>
+            <w:r>
+              <w:rPr>
+                <w:noProof/>
+                <w:webHidden/>
+              </w:rPr>
+              <w:instrText xml:space="preserve"> PAGEREF _Toc184732109 \h </w:instrText>
+            </w:r>
+            <w:r>
+              <w:rPr>
+                <w:noProof/>
+                <w:webHidden/>
+              </w:rPr>
+            </w:r>
+            <w:r>
+              <w:rPr>
+                <w:noProof/>
+                <w:webHidden/>
+              </w:rPr>
+              <w:fldChar w:fldCharType="separate"/>
+            </w:r>
+            <w:r>
+              <w:rPr>
+                <w:noProof/>
+                <w:webHidden/>
+              </w:rPr>
+              <w:t>51</w:t>
+            </w:r>
+            <w:r>
+              <w:rPr>
+                <w:noProof/>
+                <w:webHidden/>
+              </w:rPr>
+              <w:fldChar w:fldCharType="end"/>
+            </w:r>
+          </w:hyperlink>
+        </w:p>
+        <w:p>
+          <w:pPr>
+            <w:pStyle w:val="TDC3"/>
+            <w:tabs>
+              <w:tab w:val="right" w:leader="dot" w:pos="9350"/>
+            </w:tabs>
+            <w:rPr>
+              <w:rFonts w:cstheme="minorBidi"/>
+              <w:noProof/>
+            </w:rPr>
+          </w:pPr>
+          <w:hyperlink w:anchor="_Toc184732110" w:history="1">
+            <w:r>
+              <w:rPr>
+                <w:rStyle w:val="Hipervnculo"/>
+                <w:noProof/>
+              </w:rPr>
+              <w:t>Ley orgánica de ciencia Tecnología e innovación</w:t>
+            </w:r>
+            <w:r>
+              <w:rPr>
+                <w:noProof/>
+                <w:webHidden/>
+              </w:rPr>
+              <w:tab/>
+            </w:r>
+            <w:r>
+              <w:rPr>
+                <w:noProof/>
+                <w:webHidden/>
+              </w:rPr>
+              <w:fldChar w:fldCharType="begin"/>
+            </w:r>
+            <w:r>
+              <w:rPr>
+                <w:noProof/>
+                <w:webHidden/>
+              </w:rPr>
+              <w:instrText xml:space="preserve"> PAGEREF _Toc184732110 \h </w:instrText>
+            </w:r>
+            <w:r>
+              <w:rPr>
+                <w:noProof/>
+                <w:webHidden/>
+              </w:rPr>
+            </w:r>
+            <w:r>
+              <w:rPr>
+                <w:noProof/>
+                <w:webHidden/>
+              </w:rPr>
+              <w:fldChar w:fldCharType="separate"/>
+            </w:r>
+            <w:r>
+              <w:rPr>
+                <w:noProof/>
+                <w:webHidden/>
+              </w:rPr>
+              <w:t>52</w:t>
+            </w:r>
+            <w:r>
+              <w:rPr>
+                <w:noProof/>
+                <w:webHidden/>
+              </w:rPr>
+              <w:fldChar w:fldCharType="end"/>
+            </w:r>
+          </w:hyperlink>
+        </w:p>
+        <w:p>
+          <w:pPr>
+            <w:pStyle w:val="TDC1"/>
+            <w:tabs>
+              <w:tab w:val="right" w:leader="dot" w:pos="9350"/>
+            </w:tabs>
+            <w:rPr>
+              <w:rFonts w:eastAsiaTheme="minorEastAsia"/>
+              <w:noProof/>
+              <w:kern w:val="0"/>
+              <w:lang w:eastAsia="es-VE"/>
+              <w14:ligatures w14:val="none"/>
+            </w:rPr>
+          </w:pPr>
+          <w:hyperlink w:anchor="_Toc184732111" w:history="1">
+            <w:r>
+              <w:rPr>
+                <w:rStyle w:val="Hipervnculo"/>
+                <w:noProof/>
+              </w:rPr>
+              <w:t>Capitulo III</w:t>
+            </w:r>
+            <w:r>
+              <w:rPr>
+                <w:noProof/>
+                <w:webHidden/>
+              </w:rPr>
+              <w:tab/>
+            </w:r>
+            <w:r>
+              <w:rPr>
+                <w:noProof/>
+                <w:webHidden/>
+              </w:rPr>
+              <w:fldChar w:fldCharType="begin"/>
+            </w:r>
+            <w:r>
+              <w:rPr>
+                <w:noProof/>
+                <w:webHidden/>
+              </w:rPr>
+              <w:instrText xml:space="preserve"> PAGEREF _Toc184732111 \h </w:instrText>
+            </w:r>
+            <w:r>
+              <w:rPr>
+                <w:noProof/>
+                <w:webHidden/>
+              </w:rPr>
+            </w:r>
+            <w:r>
+              <w:rPr>
+                <w:noProof/>
+                <w:webHidden/>
+              </w:rPr>
+              <w:fldChar w:fldCharType="separate"/>
+            </w:r>
+            <w:r>
+              <w:rPr>
+                <w:noProof/>
+                <w:webHidden/>
+              </w:rPr>
+              <w:t>54</w:t>
+            </w:r>
+            <w:r>
+              <w:rPr>
+                <w:noProof/>
+                <w:webHidden/>
+              </w:rPr>
+              <w:fldChar w:fldCharType="end"/>
+            </w:r>
+          </w:hyperlink>
+        </w:p>
+        <w:p>
+          <w:pPr>
+            <w:pStyle w:val="TDC1"/>
+            <w:tabs>
+              <w:tab w:val="right" w:leader="dot" w:pos="9350"/>
+            </w:tabs>
+            <w:rPr>
+              <w:rFonts w:eastAsiaTheme="minorEastAsia"/>
+              <w:noProof/>
+              <w:kern w:val="0"/>
+              <w:lang w:eastAsia="es-VE"/>
+              <w14:ligatures w14:val="none"/>
+            </w:rPr>
+          </w:pPr>
+          <w:hyperlink w:anchor="_Toc184732112" w:history="1">
+            <w:r>
+              <w:rPr>
+                <w:rStyle w:val="Hipervnculo"/>
+                <w:noProof/>
+              </w:rPr>
+              <w:t>Marco Metodológico</w:t>
+            </w:r>
+            <w:r>
+              <w:rPr>
+                <w:noProof/>
+                <w:webHidden/>
+              </w:rPr>
+              <w:tab/>
+            </w:r>
+            <w:r>
+              <w:rPr>
+                <w:noProof/>
+                <w:webHidden/>
+              </w:rPr>
+              <w:fldChar w:fldCharType="begin"/>
+            </w:r>
+            <w:r>
+              <w:rPr>
+                <w:noProof/>
+                <w:webHidden/>
+              </w:rPr>
+              <w:instrText xml:space="preserve"> PAGEREF _Toc184732112 \h </w:instrText>
+            </w:r>
+            <w:r>
+              <w:rPr>
+                <w:noProof/>
+                <w:webHidden/>
+              </w:rPr>
+            </w:r>
+            <w:r>
+              <w:rPr>
+                <w:noProof/>
+                <w:webHidden/>
+              </w:rPr>
+              <w:fldChar w:fldCharType="separate"/>
+            </w:r>
+            <w:r>
+              <w:rPr>
+                <w:noProof/>
+                <w:webHidden/>
+              </w:rPr>
+              <w:t>54</w:t>
             </w:r>
             <w:r>
               <w:rPr>
@@ -2627,13 +3440,13 @@
               <w14:ligatures w14:val="none"/>
             </w:rPr>
           </w:pPr>
-          <w:hyperlink w:anchor="_Toc182761962" w:history="1">
+          <w:hyperlink w:anchor="_Toc184732113" w:history="1">
             <w:r>
               <w:rPr>
                 <w:rStyle w:val="Hipervnculo"/>
                 <w:noProof/>
               </w:rPr>
-              <w:t>2.4ley orgánica de ciencia Tecnología e innovación</w:t>
+              <w:t>3.1 Tipo de investigación</w:t>
             </w:r>
             <w:r>
               <w:rPr>
@@ -2654,7 +3467,7 @@
                 <w:noProof/>
                 <w:webHidden/>
               </w:rPr>
-              <w:instrText xml:space="preserve"> PAGEREF _Toc182761962 \h </w:instrText>
+              <w:instrText xml:space="preserve"> PAGEREF _Toc184732113 \h </w:instrText>
             </w:r>
             <w:r>
               <w:rPr>
@@ -2674,7 +3487,916 @@
                 <w:noProof/>
                 <w:webHidden/>
               </w:rPr>
-              <w:t>31</w:t>
+              <w:t>54</w:t>
+            </w:r>
+            <w:r>
+              <w:rPr>
+                <w:noProof/>
+                <w:webHidden/>
+              </w:rPr>
+              <w:fldChar w:fldCharType="end"/>
+            </w:r>
+          </w:hyperlink>
+        </w:p>
+        <w:p>
+          <w:pPr>
+            <w:pStyle w:val="TDC2"/>
+            <w:tabs>
+              <w:tab w:val="right" w:leader="dot" w:pos="9350"/>
+            </w:tabs>
+            <w:rPr>
+              <w:rFonts w:eastAsiaTheme="minorEastAsia"/>
+              <w:noProof/>
+              <w:kern w:val="0"/>
+              <w:lang w:eastAsia="es-VE"/>
+              <w14:ligatures w14:val="none"/>
+            </w:rPr>
+          </w:pPr>
+          <w:hyperlink w:anchor="_Toc184732114" w:history="1">
+            <w:r>
+              <w:rPr>
+                <w:rStyle w:val="Hipervnculo"/>
+                <w:noProof/>
+              </w:rPr>
+              <w:t>3.2 Técnicas e instrumentos de recolección de datos</w:t>
+            </w:r>
+            <w:r>
+              <w:rPr>
+                <w:noProof/>
+                <w:webHidden/>
+              </w:rPr>
+              <w:tab/>
+            </w:r>
+            <w:r>
+              <w:rPr>
+                <w:noProof/>
+                <w:webHidden/>
+              </w:rPr>
+              <w:fldChar w:fldCharType="begin"/>
+            </w:r>
+            <w:r>
+              <w:rPr>
+                <w:noProof/>
+                <w:webHidden/>
+              </w:rPr>
+              <w:instrText xml:space="preserve"> PAGEREF _Toc184732114 \h </w:instrText>
+            </w:r>
+            <w:r>
+              <w:rPr>
+                <w:noProof/>
+                <w:webHidden/>
+              </w:rPr>
+            </w:r>
+            <w:r>
+              <w:rPr>
+                <w:noProof/>
+                <w:webHidden/>
+              </w:rPr>
+              <w:fldChar w:fldCharType="separate"/>
+            </w:r>
+            <w:r>
+              <w:rPr>
+                <w:noProof/>
+                <w:webHidden/>
+              </w:rPr>
+              <w:t>55</w:t>
+            </w:r>
+            <w:r>
+              <w:rPr>
+                <w:noProof/>
+                <w:webHidden/>
+              </w:rPr>
+              <w:fldChar w:fldCharType="end"/>
+            </w:r>
+          </w:hyperlink>
+        </w:p>
+        <w:p>
+          <w:pPr>
+            <w:pStyle w:val="TDC2"/>
+            <w:tabs>
+              <w:tab w:val="right" w:leader="dot" w:pos="9350"/>
+            </w:tabs>
+            <w:rPr>
+              <w:rFonts w:eastAsiaTheme="minorEastAsia"/>
+              <w:noProof/>
+              <w:kern w:val="0"/>
+              <w:lang w:eastAsia="es-VE"/>
+              <w14:ligatures w14:val="none"/>
+            </w:rPr>
+          </w:pPr>
+          <w:hyperlink w:anchor="_Toc184732115" w:history="1">
+            <w:r>
+              <w:rPr>
+                <w:rStyle w:val="Hipervnculo"/>
+                <w:noProof/>
+              </w:rPr>
+              <w:t>3.3 Población y muestra</w:t>
+            </w:r>
+            <w:r>
+              <w:rPr>
+                <w:noProof/>
+                <w:webHidden/>
+              </w:rPr>
+              <w:tab/>
+            </w:r>
+            <w:r>
+              <w:rPr>
+                <w:noProof/>
+                <w:webHidden/>
+              </w:rPr>
+              <w:fldChar w:fldCharType="begin"/>
+            </w:r>
+            <w:r>
+              <w:rPr>
+                <w:noProof/>
+                <w:webHidden/>
+              </w:rPr>
+              <w:instrText xml:space="preserve"> PAGEREF _Toc184732115 \h </w:instrText>
+            </w:r>
+            <w:r>
+              <w:rPr>
+                <w:noProof/>
+                <w:webHidden/>
+              </w:rPr>
+            </w:r>
+            <w:r>
+              <w:rPr>
+                <w:noProof/>
+                <w:webHidden/>
+              </w:rPr>
+              <w:fldChar w:fldCharType="separate"/>
+            </w:r>
+            <w:r>
+              <w:rPr>
+                <w:noProof/>
+                <w:webHidden/>
+              </w:rPr>
+              <w:t>55</w:t>
+            </w:r>
+            <w:r>
+              <w:rPr>
+                <w:noProof/>
+                <w:webHidden/>
+              </w:rPr>
+              <w:fldChar w:fldCharType="end"/>
+            </w:r>
+          </w:hyperlink>
+        </w:p>
+        <w:p>
+          <w:pPr>
+            <w:pStyle w:val="TDC3"/>
+            <w:tabs>
+              <w:tab w:val="right" w:leader="dot" w:pos="9350"/>
+            </w:tabs>
+            <w:rPr>
+              <w:rFonts w:cstheme="minorBidi"/>
+              <w:noProof/>
+            </w:rPr>
+          </w:pPr>
+          <w:hyperlink w:anchor="_Toc184732116" w:history="1">
+            <w:r>
+              <w:rPr>
+                <w:rStyle w:val="Hipervnculo"/>
+                <w:noProof/>
+                <w:lang w:val="es-MX"/>
+              </w:rPr>
+              <w:t>Población</w:t>
+            </w:r>
+            <w:r>
+              <w:rPr>
+                <w:noProof/>
+                <w:webHidden/>
+              </w:rPr>
+              <w:tab/>
+            </w:r>
+            <w:r>
+              <w:rPr>
+                <w:noProof/>
+                <w:webHidden/>
+              </w:rPr>
+              <w:fldChar w:fldCharType="begin"/>
+            </w:r>
+            <w:r>
+              <w:rPr>
+                <w:noProof/>
+                <w:webHidden/>
+              </w:rPr>
+              <w:instrText xml:space="preserve"> PAGEREF _Toc184732116 \h </w:instrText>
+            </w:r>
+            <w:r>
+              <w:rPr>
+                <w:noProof/>
+                <w:webHidden/>
+              </w:rPr>
+            </w:r>
+            <w:r>
+              <w:rPr>
+                <w:noProof/>
+                <w:webHidden/>
+              </w:rPr>
+              <w:fldChar w:fldCharType="separate"/>
+            </w:r>
+            <w:r>
+              <w:rPr>
+                <w:noProof/>
+                <w:webHidden/>
+              </w:rPr>
+              <w:t>55</w:t>
+            </w:r>
+            <w:r>
+              <w:rPr>
+                <w:noProof/>
+                <w:webHidden/>
+              </w:rPr>
+              <w:fldChar w:fldCharType="end"/>
+            </w:r>
+          </w:hyperlink>
+        </w:p>
+        <w:p>
+          <w:pPr>
+            <w:pStyle w:val="TDC3"/>
+            <w:tabs>
+              <w:tab w:val="right" w:leader="dot" w:pos="9350"/>
+            </w:tabs>
+            <w:rPr>
+              <w:rFonts w:cstheme="minorBidi"/>
+              <w:noProof/>
+            </w:rPr>
+          </w:pPr>
+          <w:hyperlink w:anchor="_Toc184732117" w:history="1">
+            <w:r>
+              <w:rPr>
+                <w:rStyle w:val="Hipervnculo"/>
+                <w:noProof/>
+                <w:lang w:val="es-MX"/>
+              </w:rPr>
+              <w:t>Muestra</w:t>
+            </w:r>
+            <w:r>
+              <w:rPr>
+                <w:noProof/>
+                <w:webHidden/>
+              </w:rPr>
+              <w:tab/>
+            </w:r>
+            <w:r>
+              <w:rPr>
+                <w:noProof/>
+                <w:webHidden/>
+              </w:rPr>
+              <w:fldChar w:fldCharType="begin"/>
+            </w:r>
+            <w:r>
+              <w:rPr>
+                <w:noProof/>
+                <w:webHidden/>
+              </w:rPr>
+              <w:instrText xml:space="preserve"> PAGEREF _Toc184732117 \h </w:instrText>
+            </w:r>
+            <w:r>
+              <w:rPr>
+                <w:noProof/>
+                <w:webHidden/>
+              </w:rPr>
+            </w:r>
+            <w:r>
+              <w:rPr>
+                <w:noProof/>
+                <w:webHidden/>
+              </w:rPr>
+              <w:fldChar w:fldCharType="separate"/>
+            </w:r>
+            <w:r>
+              <w:rPr>
+                <w:noProof/>
+                <w:webHidden/>
+              </w:rPr>
+              <w:t>56</w:t>
+            </w:r>
+            <w:r>
+              <w:rPr>
+                <w:noProof/>
+                <w:webHidden/>
+              </w:rPr>
+              <w:fldChar w:fldCharType="end"/>
+            </w:r>
+          </w:hyperlink>
+        </w:p>
+        <w:p>
+          <w:pPr>
+            <w:pStyle w:val="TDC2"/>
+            <w:tabs>
+              <w:tab w:val="right" w:leader="dot" w:pos="9350"/>
+            </w:tabs>
+            <w:rPr>
+              <w:rFonts w:eastAsiaTheme="minorEastAsia"/>
+              <w:noProof/>
+              <w:kern w:val="0"/>
+              <w:lang w:eastAsia="es-VE"/>
+              <w14:ligatures w14:val="none"/>
+            </w:rPr>
+          </w:pPr>
+          <w:hyperlink w:anchor="_Toc184732118" w:history="1">
+            <w:r>
+              <w:rPr>
+                <w:rStyle w:val="Hipervnculo"/>
+                <w:noProof/>
+              </w:rPr>
+              <w:t>3.5 Metodología Aplicada</w:t>
+            </w:r>
+            <w:r>
+              <w:rPr>
+                <w:noProof/>
+                <w:webHidden/>
+              </w:rPr>
+              <w:tab/>
+            </w:r>
+            <w:r>
+              <w:rPr>
+                <w:noProof/>
+                <w:webHidden/>
+              </w:rPr>
+              <w:fldChar w:fldCharType="begin"/>
+            </w:r>
+            <w:r>
+              <w:rPr>
+                <w:noProof/>
+                <w:webHidden/>
+              </w:rPr>
+              <w:instrText xml:space="preserve"> PAGEREF _Toc184732118 \h </w:instrText>
+            </w:r>
+            <w:r>
+              <w:rPr>
+                <w:noProof/>
+                <w:webHidden/>
+              </w:rPr>
+            </w:r>
+            <w:r>
+              <w:rPr>
+                <w:noProof/>
+                <w:webHidden/>
+              </w:rPr>
+              <w:fldChar w:fldCharType="separate"/>
+            </w:r>
+            <w:r>
+              <w:rPr>
+                <w:noProof/>
+                <w:webHidden/>
+              </w:rPr>
+              <w:t>56</w:t>
+            </w:r>
+            <w:r>
+              <w:rPr>
+                <w:noProof/>
+                <w:webHidden/>
+              </w:rPr>
+              <w:fldChar w:fldCharType="end"/>
+            </w:r>
+          </w:hyperlink>
+        </w:p>
+        <w:p>
+          <w:pPr>
+            <w:pStyle w:val="TDC3"/>
+            <w:tabs>
+              <w:tab w:val="right" w:leader="dot" w:pos="9350"/>
+            </w:tabs>
+            <w:rPr>
+              <w:rFonts w:cstheme="minorBidi"/>
+              <w:noProof/>
+            </w:rPr>
+          </w:pPr>
+          <w:hyperlink w:anchor="_Toc184732119" w:history="1">
+            <w:r>
+              <w:rPr>
+                <w:rStyle w:val="Hipervnculo"/>
+                <w:noProof/>
+              </w:rPr>
+              <w:t>Metodología Ágil</w:t>
+            </w:r>
+            <w:r>
+              <w:rPr>
+                <w:noProof/>
+                <w:webHidden/>
+              </w:rPr>
+              <w:tab/>
+            </w:r>
+            <w:r>
+              <w:rPr>
+                <w:noProof/>
+                <w:webHidden/>
+              </w:rPr>
+              <w:fldChar w:fldCharType="begin"/>
+            </w:r>
+            <w:r>
+              <w:rPr>
+                <w:noProof/>
+                <w:webHidden/>
+              </w:rPr>
+              <w:instrText xml:space="preserve"> PAGEREF _Toc184732119 \h </w:instrText>
+            </w:r>
+            <w:r>
+              <w:rPr>
+                <w:noProof/>
+                <w:webHidden/>
+              </w:rPr>
+            </w:r>
+            <w:r>
+              <w:rPr>
+                <w:noProof/>
+                <w:webHidden/>
+              </w:rPr>
+              <w:fldChar w:fldCharType="separate"/>
+            </w:r>
+            <w:r>
+              <w:rPr>
+                <w:noProof/>
+                <w:webHidden/>
+              </w:rPr>
+              <w:t>56</w:t>
+            </w:r>
+            <w:r>
+              <w:rPr>
+                <w:noProof/>
+                <w:webHidden/>
+              </w:rPr>
+              <w:fldChar w:fldCharType="end"/>
+            </w:r>
+          </w:hyperlink>
+        </w:p>
+        <w:p>
+          <w:pPr>
+            <w:pStyle w:val="TDC3"/>
+            <w:tabs>
+              <w:tab w:val="right" w:leader="dot" w:pos="9350"/>
+            </w:tabs>
+            <w:rPr>
+              <w:rFonts w:cstheme="minorBidi"/>
+              <w:noProof/>
+            </w:rPr>
+          </w:pPr>
+          <w:hyperlink w:anchor="_Toc184732120" w:history="1">
+            <w:r>
+              <w:rPr>
+                <w:rStyle w:val="Hipervnculo"/>
+                <w:noProof/>
+                <w:shd w:val="clear" w:color="auto" w:fill="FFFFFF"/>
+              </w:rPr>
+              <w:t>Scrum</w:t>
+            </w:r>
+            <w:r>
+              <w:rPr>
+                <w:noProof/>
+                <w:webHidden/>
+              </w:rPr>
+              <w:tab/>
+            </w:r>
+            <w:r>
+              <w:rPr>
+                <w:noProof/>
+                <w:webHidden/>
+              </w:rPr>
+              <w:fldChar w:fldCharType="begin"/>
+            </w:r>
+            <w:r>
+              <w:rPr>
+                <w:noProof/>
+                <w:webHidden/>
+              </w:rPr>
+              <w:instrText xml:space="preserve"> PAGEREF _Toc184732120 \h </w:instrText>
+            </w:r>
+            <w:r>
+              <w:rPr>
+                <w:noProof/>
+                <w:webHidden/>
+              </w:rPr>
+            </w:r>
+            <w:r>
+              <w:rPr>
+                <w:noProof/>
+                <w:webHidden/>
+              </w:rPr>
+              <w:fldChar w:fldCharType="separate"/>
+            </w:r>
+            <w:r>
+              <w:rPr>
+                <w:noProof/>
+                <w:webHidden/>
+              </w:rPr>
+              <w:t>57</w:t>
+            </w:r>
+            <w:r>
+              <w:rPr>
+                <w:noProof/>
+                <w:webHidden/>
+              </w:rPr>
+              <w:fldChar w:fldCharType="end"/>
+            </w:r>
+          </w:hyperlink>
+        </w:p>
+        <w:p>
+          <w:pPr>
+            <w:pStyle w:val="TDC3"/>
+            <w:tabs>
+              <w:tab w:val="right" w:leader="dot" w:pos="9350"/>
+            </w:tabs>
+            <w:rPr>
+              <w:rFonts w:cstheme="minorBidi"/>
+              <w:noProof/>
+            </w:rPr>
+          </w:pPr>
+          <w:hyperlink w:anchor="_Toc184732121" w:history="1">
+            <w:r>
+              <w:rPr>
+                <w:rStyle w:val="Hipervnculo"/>
+                <w:noProof/>
+              </w:rPr>
+              <w:t>El equipo Scrum</w:t>
+            </w:r>
+            <w:r>
+              <w:rPr>
+                <w:noProof/>
+                <w:webHidden/>
+              </w:rPr>
+              <w:tab/>
+            </w:r>
+            <w:r>
+              <w:rPr>
+                <w:noProof/>
+                <w:webHidden/>
+              </w:rPr>
+              <w:fldChar w:fldCharType="begin"/>
+            </w:r>
+            <w:r>
+              <w:rPr>
+                <w:noProof/>
+                <w:webHidden/>
+              </w:rPr>
+              <w:instrText xml:space="preserve"> PAGEREF _Toc184732121 \h </w:instrText>
+            </w:r>
+            <w:r>
+              <w:rPr>
+                <w:noProof/>
+                <w:webHidden/>
+              </w:rPr>
+            </w:r>
+            <w:r>
+              <w:rPr>
+                <w:noProof/>
+                <w:webHidden/>
+              </w:rPr>
+              <w:fldChar w:fldCharType="separate"/>
+            </w:r>
+            <w:r>
+              <w:rPr>
+                <w:noProof/>
+                <w:webHidden/>
+              </w:rPr>
+              <w:t>58</w:t>
+            </w:r>
+            <w:r>
+              <w:rPr>
+                <w:noProof/>
+                <w:webHidden/>
+              </w:rPr>
+              <w:fldChar w:fldCharType="end"/>
+            </w:r>
+          </w:hyperlink>
+        </w:p>
+        <w:p>
+          <w:pPr>
+            <w:pStyle w:val="TDC3"/>
+            <w:tabs>
+              <w:tab w:val="right" w:leader="dot" w:pos="9350"/>
+            </w:tabs>
+            <w:rPr>
+              <w:rFonts w:cstheme="minorBidi"/>
+              <w:noProof/>
+            </w:rPr>
+          </w:pPr>
+          <w:hyperlink w:anchor="_Toc184732122" w:history="1">
+            <w:r>
+              <w:rPr>
+                <w:rStyle w:val="Hipervnculo"/>
+                <w:noProof/>
+              </w:rPr>
+              <w:t>Product Owner (Dueño del Producto)</w:t>
+            </w:r>
+            <w:r>
+              <w:rPr>
+                <w:noProof/>
+                <w:webHidden/>
+              </w:rPr>
+              <w:tab/>
+            </w:r>
+            <w:r>
+              <w:rPr>
+                <w:noProof/>
+                <w:webHidden/>
+              </w:rPr>
+              <w:fldChar w:fldCharType="begin"/>
+            </w:r>
+            <w:r>
+              <w:rPr>
+                <w:noProof/>
+                <w:webHidden/>
+              </w:rPr>
+              <w:instrText xml:space="preserve"> PAGEREF _Toc184732122 \h </w:instrText>
+            </w:r>
+            <w:r>
+              <w:rPr>
+                <w:noProof/>
+                <w:webHidden/>
+              </w:rPr>
+            </w:r>
+            <w:r>
+              <w:rPr>
+                <w:noProof/>
+                <w:webHidden/>
+              </w:rPr>
+              <w:fldChar w:fldCharType="separate"/>
+            </w:r>
+            <w:r>
+              <w:rPr>
+                <w:noProof/>
+                <w:webHidden/>
+              </w:rPr>
+              <w:t>58</w:t>
+            </w:r>
+            <w:r>
+              <w:rPr>
+                <w:noProof/>
+                <w:webHidden/>
+              </w:rPr>
+              <w:fldChar w:fldCharType="end"/>
+            </w:r>
+          </w:hyperlink>
+        </w:p>
+        <w:p>
+          <w:pPr>
+            <w:pStyle w:val="TDC3"/>
+            <w:tabs>
+              <w:tab w:val="right" w:leader="dot" w:pos="9350"/>
+            </w:tabs>
+            <w:rPr>
+              <w:rFonts w:cstheme="minorBidi"/>
+              <w:noProof/>
+            </w:rPr>
+          </w:pPr>
+          <w:hyperlink w:anchor="_Toc184732123" w:history="1">
+            <w:r>
+              <w:rPr>
+                <w:rStyle w:val="Hipervnculo"/>
+                <w:noProof/>
+              </w:rPr>
+              <w:t>Development Team (Equipo de desarrollo)</w:t>
+            </w:r>
+            <w:r>
+              <w:rPr>
+                <w:noProof/>
+                <w:webHidden/>
+              </w:rPr>
+              <w:tab/>
+            </w:r>
+            <w:r>
+              <w:rPr>
+                <w:noProof/>
+                <w:webHidden/>
+              </w:rPr>
+              <w:fldChar w:fldCharType="begin"/>
+            </w:r>
+            <w:r>
+              <w:rPr>
+                <w:noProof/>
+                <w:webHidden/>
+              </w:rPr>
+              <w:instrText xml:space="preserve"> PAGEREF _Toc184732123 \h </w:instrText>
+            </w:r>
+            <w:r>
+              <w:rPr>
+                <w:noProof/>
+                <w:webHidden/>
+              </w:rPr>
+            </w:r>
+            <w:r>
+              <w:rPr>
+                <w:noProof/>
+                <w:webHidden/>
+              </w:rPr>
+              <w:fldChar w:fldCharType="separate"/>
+            </w:r>
+            <w:r>
+              <w:rPr>
+                <w:noProof/>
+                <w:webHidden/>
+              </w:rPr>
+              <w:t>59</w:t>
+            </w:r>
+            <w:r>
+              <w:rPr>
+                <w:noProof/>
+                <w:webHidden/>
+              </w:rPr>
+              <w:fldChar w:fldCharType="end"/>
+            </w:r>
+          </w:hyperlink>
+        </w:p>
+        <w:p>
+          <w:pPr>
+            <w:pStyle w:val="TDC3"/>
+            <w:tabs>
+              <w:tab w:val="right" w:leader="dot" w:pos="9350"/>
+            </w:tabs>
+            <w:rPr>
+              <w:rFonts w:cstheme="minorBidi"/>
+              <w:noProof/>
+            </w:rPr>
+          </w:pPr>
+          <w:hyperlink w:anchor="_Toc184732124" w:history="1">
+            <w:r>
+              <w:rPr>
+                <w:rStyle w:val="Hipervnculo"/>
+                <w:noProof/>
+              </w:rPr>
+              <w:t>Scrum Master</w:t>
+            </w:r>
+            <w:r>
+              <w:rPr>
+                <w:noProof/>
+                <w:webHidden/>
+              </w:rPr>
+              <w:tab/>
+            </w:r>
+            <w:r>
+              <w:rPr>
+                <w:noProof/>
+                <w:webHidden/>
+              </w:rPr>
+              <w:fldChar w:fldCharType="begin"/>
+            </w:r>
+            <w:r>
+              <w:rPr>
+                <w:noProof/>
+                <w:webHidden/>
+              </w:rPr>
+              <w:instrText xml:space="preserve"> PAGEREF _Toc184732124 \h </w:instrText>
+            </w:r>
+            <w:r>
+              <w:rPr>
+                <w:noProof/>
+                <w:webHidden/>
+              </w:rPr>
+            </w:r>
+            <w:r>
+              <w:rPr>
+                <w:noProof/>
+                <w:webHidden/>
+              </w:rPr>
+              <w:fldChar w:fldCharType="separate"/>
+            </w:r>
+            <w:r>
+              <w:rPr>
+                <w:noProof/>
+                <w:webHidden/>
+              </w:rPr>
+              <w:t>59</w:t>
+            </w:r>
+            <w:r>
+              <w:rPr>
+                <w:noProof/>
+                <w:webHidden/>
+              </w:rPr>
+              <w:fldChar w:fldCharType="end"/>
+            </w:r>
+          </w:hyperlink>
+        </w:p>
+        <w:p>
+          <w:pPr>
+            <w:pStyle w:val="TDC3"/>
+            <w:tabs>
+              <w:tab w:val="right" w:leader="dot" w:pos="9350"/>
+            </w:tabs>
+            <w:rPr>
+              <w:rFonts w:cstheme="minorBidi"/>
+              <w:noProof/>
+            </w:rPr>
+          </w:pPr>
+          <w:hyperlink w:anchor="_Toc184732125" w:history="1">
+            <w:r>
+              <w:rPr>
+                <w:rStyle w:val="Hipervnculo"/>
+                <w:noProof/>
+              </w:rPr>
+              <w:t>Eventos Scrum</w:t>
+            </w:r>
+            <w:r>
+              <w:rPr>
+                <w:noProof/>
+                <w:webHidden/>
+              </w:rPr>
+              <w:tab/>
+            </w:r>
+            <w:r>
+              <w:rPr>
+                <w:noProof/>
+                <w:webHidden/>
+              </w:rPr>
+              <w:fldChar w:fldCharType="begin"/>
+            </w:r>
+            <w:r>
+              <w:rPr>
+                <w:noProof/>
+                <w:webHidden/>
+              </w:rPr>
+              <w:instrText xml:space="preserve"> PAGEREF _Toc184732125 \h </w:instrText>
+            </w:r>
+            <w:r>
+              <w:rPr>
+                <w:noProof/>
+                <w:webHidden/>
+              </w:rPr>
+            </w:r>
+            <w:r>
+              <w:rPr>
+                <w:noProof/>
+                <w:webHidden/>
+              </w:rPr>
+              <w:fldChar w:fldCharType="separate"/>
+            </w:r>
+            <w:r>
+              <w:rPr>
+                <w:noProof/>
+                <w:webHidden/>
+              </w:rPr>
+              <w:t>61</w:t>
+            </w:r>
+            <w:r>
+              <w:rPr>
+                <w:noProof/>
+                <w:webHidden/>
+              </w:rPr>
+              <w:fldChar w:fldCharType="end"/>
+            </w:r>
+          </w:hyperlink>
+        </w:p>
+        <w:p>
+          <w:pPr>
+            <w:pStyle w:val="TDC3"/>
+            <w:tabs>
+              <w:tab w:val="right" w:leader="dot" w:pos="9350"/>
+            </w:tabs>
+            <w:rPr>
+              <w:rFonts w:cstheme="minorBidi"/>
+              <w:noProof/>
+            </w:rPr>
+          </w:pPr>
+          <w:hyperlink w:anchor="_Toc184732126" w:history="1">
+            <w:r>
+              <w:rPr>
+                <w:rStyle w:val="Hipervnculo"/>
+                <w:noProof/>
+              </w:rPr>
+              <w:t>Sprint</w:t>
+            </w:r>
+            <w:r>
+              <w:rPr>
+                <w:noProof/>
+                <w:webHidden/>
+              </w:rPr>
+              <w:tab/>
+            </w:r>
+            <w:r>
+              <w:rPr>
+                <w:noProof/>
+                <w:webHidden/>
+              </w:rPr>
+              <w:fldChar w:fldCharType="begin"/>
+            </w:r>
+            <w:r>
+              <w:rPr>
+                <w:noProof/>
+                <w:webHidden/>
+              </w:rPr>
+              <w:instrText xml:space="preserve"> PAGEREF _Toc184732126 \h </w:instrText>
+            </w:r>
+            <w:r>
+              <w:rPr>
+                <w:noProof/>
+                <w:webHidden/>
+              </w:rPr>
+            </w:r>
+            <w:r>
+              <w:rPr>
+                <w:noProof/>
+                <w:webHidden/>
+              </w:rPr>
+              <w:fldChar w:fldCharType="separate"/>
+            </w:r>
+            <w:r>
+              <w:rPr>
+                <w:noProof/>
+                <w:webHidden/>
+              </w:rPr>
+              <w:t>61</w:t>
             </w:r>
             <w:r>
               <w:rPr>
@@ -2715,7 +4437,7 @@
           <w:rFonts w:cs="Arial"/>
         </w:rPr>
       </w:pPr>
-      <w:bookmarkStart w:id="1" w:name="_Toc182761933"/>
+      <w:bookmarkStart w:id="1" w:name="_Toc184732073"/>
       <w:r>
         <w:rPr>
           <w:rFonts w:cs="Arial"/>
@@ -2887,7 +4609,7 @@
           <w:rFonts w:cs="Arial"/>
         </w:rPr>
       </w:pPr>
-      <w:bookmarkStart w:id="2" w:name="_Toc182761934"/>
+      <w:bookmarkStart w:id="2" w:name="_Toc184732074"/>
       <w:r>
         <w:rPr>
           <w:rFonts w:cs="Arial"/>
@@ -2910,7 +4632,7 @@
         </w:rPr>
         <w:t xml:space="preserve"> </w:t>
       </w:r>
-      <w:bookmarkStart w:id="3" w:name="_Toc182761935"/>
+      <w:bookmarkStart w:id="3" w:name="_Toc184732075"/>
       <w:r>
         <w:rPr>
           <w:rFonts w:cs="Arial"/>
@@ -2945,7 +4667,7 @@
       <w:pPr>
         <w:pStyle w:val="Ttulo2"/>
       </w:pPr>
-      <w:bookmarkStart w:id="4" w:name="_Toc182761936"/>
+      <w:bookmarkStart w:id="4" w:name="_Toc184732076"/>
       <w:r>
         <w:t xml:space="preserve">1.1 </w:t>
       </w:r>
@@ -2976,7 +4698,7 @@
       <w:pPr>
         <w:pStyle w:val="Ttulo2"/>
       </w:pPr>
-      <w:bookmarkStart w:id="5" w:name="_Toc182761937"/>
+      <w:bookmarkStart w:id="5" w:name="_Toc184732077"/>
       <w:r>
         <w:t xml:space="preserve">1.2 </w:t>
       </w:r>
@@ -2998,7 +4720,7 @@
       <w:pPr>
         <w:pStyle w:val="Ttulo2"/>
       </w:pPr>
-      <w:bookmarkStart w:id="6" w:name="_Toc182761938"/>
+      <w:bookmarkStart w:id="6" w:name="_Toc184732078"/>
       <w:r>
         <w:lastRenderedPageBreak/>
         <w:t xml:space="preserve">1.3 </w:t>
@@ -3214,7 +4936,7 @@
       <w:pPr>
         <w:pStyle w:val="Ttulo2"/>
       </w:pPr>
-      <w:bookmarkStart w:id="7" w:name="_Toc182761939"/>
+      <w:bookmarkStart w:id="7" w:name="_Toc184732079"/>
       <w:r>
         <w:lastRenderedPageBreak/>
         <w:t xml:space="preserve">1.4 </w:t>
@@ -3807,7 +5529,7 @@
       <w:pPr>
         <w:pStyle w:val="Ttulo2"/>
       </w:pPr>
-      <w:bookmarkStart w:id="8" w:name="_Toc182761940"/>
+      <w:bookmarkStart w:id="8" w:name="_Toc184732080"/>
       <w:r>
         <w:t xml:space="preserve">1.5 Nombre de las organizaciones presentes en la </w:t>
       </w:r>
@@ -3872,7 +5594,7 @@
       <w:pPr>
         <w:pStyle w:val="Ttulo2"/>
       </w:pPr>
-      <w:bookmarkStart w:id="10" w:name="_Toc182761941"/>
+      <w:bookmarkStart w:id="10" w:name="_Toc184732081"/>
       <w:r>
         <w:t>1.6 análisis de fortalezas y debilidades de la institución</w:t>
       </w:r>
@@ -4220,7 +5942,7 @@
           <w:bCs/>
         </w:rPr>
       </w:pPr>
-      <w:bookmarkStart w:id="11" w:name="_Toc182761942"/>
+      <w:bookmarkStart w:id="11" w:name="_Toc184732082"/>
       <w:r>
         <w:t xml:space="preserve">1.7 </w:t>
       </w:r>
@@ -4280,7 +6002,7 @@
           <w:rFonts w:eastAsia="Arial"/>
         </w:rPr>
       </w:pPr>
-      <w:bookmarkStart w:id="12" w:name="_Toc182761943"/>
+      <w:bookmarkStart w:id="12" w:name="_Toc184732083"/>
       <w:r>
         <w:rPr>
           <w:rStyle w:val="APACar"/>
@@ -4491,7 +6213,7 @@
           <w:rFonts w:eastAsia="Arial"/>
         </w:rPr>
       </w:pPr>
-      <w:bookmarkStart w:id="13" w:name="_Toc182761944"/>
+      <w:bookmarkStart w:id="13" w:name="_Toc184732084"/>
       <w:r>
         <w:rPr>
           <w:rFonts w:eastAsia="Arial"/>
@@ -4593,7 +6315,7 @@
           <w:rFonts w:eastAsia="Arial"/>
         </w:rPr>
       </w:pPr>
-      <w:bookmarkStart w:id="14" w:name="_Toc182761945"/>
+      <w:bookmarkStart w:id="14" w:name="_Toc184732085"/>
       <w:r>
         <w:rPr>
           <w:rFonts w:eastAsia="Arial"/>
@@ -4818,7 +6540,7 @@
           <w:lang w:val="es"/>
         </w:rPr>
       </w:pPr>
-      <w:bookmarkStart w:id="15" w:name="_Toc182761946"/>
+      <w:bookmarkStart w:id="15" w:name="_Toc184732086"/>
       <w:r>
         <w:rPr>
           <w:rFonts w:eastAsia="Arial"/>
@@ -4993,7 +6715,7 @@
           <w:rFonts w:eastAsia="Arial"/>
         </w:rPr>
       </w:pPr>
-      <w:bookmarkStart w:id="16" w:name="_Toc182761947"/>
+      <w:bookmarkStart w:id="16" w:name="_Toc184732087"/>
       <w:r>
         <w:rPr>
           <w:rFonts w:eastAsia="Arial"/>
@@ -5168,7 +6890,7 @@
           <w:bCs/>
         </w:rPr>
       </w:pPr>
-      <w:bookmarkStart w:id="17" w:name="_Toc182761948"/>
+      <w:bookmarkStart w:id="17" w:name="_Toc184732088"/>
       <w:r>
         <w:t xml:space="preserve">1.13 </w:t>
       </w:r>
@@ -5608,7 +7330,7 @@
       <w:pPr>
         <w:pStyle w:val="Ttulo2"/>
       </w:pPr>
-      <w:bookmarkStart w:id="18" w:name="_Toc182761949"/>
+      <w:bookmarkStart w:id="18" w:name="_Toc184732089"/>
       <w:r>
         <w:t xml:space="preserve">1.14 </w:t>
       </w:r>
@@ -5899,7 +7621,7 @@
       <w:pPr>
         <w:pStyle w:val="Ttulo2"/>
       </w:pPr>
-      <w:bookmarkStart w:id="19" w:name="_Toc182761950"/>
+      <w:bookmarkStart w:id="19" w:name="_Toc184732090"/>
       <w:r>
         <w:t xml:space="preserve">1.15 </w:t>
       </w:r>
@@ -6070,7 +7792,7 @@
       <w:pPr>
         <w:pStyle w:val="Ttulo2"/>
       </w:pPr>
-      <w:bookmarkStart w:id="20" w:name="_Toc182761951"/>
+      <w:bookmarkStart w:id="20" w:name="_Toc184732091"/>
       <w:r>
         <w:t xml:space="preserve">1.16 </w:t>
       </w:r>
@@ -6086,26 +7808,20 @@
         <w:jc w:val="both"/>
       </w:pPr>
       <w:r>
-        <w:t>Desarrollar</w:t>
-      </w:r>
-      <w:r>
-        <w:t xml:space="preserve"> </w:t>
-      </w:r>
-      <w:r>
-        <w:t>un sistema de entorno web para el control administrativo de “New Goal English Academy C.A”</w:t>
-      </w:r>
-    </w:p>
-    <w:p>
-      <w:pPr>
-        <w:pStyle w:val="APA"/>
-        <w:jc w:val="both"/>
-      </w:pPr>
+        <w:t>Desarroll</w:t>
+      </w:r>
+      <w:r>
+        <w:t xml:space="preserve">ar </w:t>
+      </w:r>
+      <w:r>
+        <w:t>un sistema de entorno web para el control periódico de registro de estudiantes, pagos y gastos en “New Goal English Academy C.A”, Cumana, Sucre, Venezuela. Año 2024</w:t>
+      </w:r>
     </w:p>
     <w:p>
       <w:pPr>
         <w:pStyle w:val="Ttulo2"/>
       </w:pPr>
-      <w:bookmarkStart w:id="21" w:name="_Toc182761952"/>
+      <w:bookmarkStart w:id="21" w:name="_Toc184732092"/>
       <w:r>
         <w:t xml:space="preserve">1.17 </w:t>
       </w:r>
@@ -6184,7 +7900,10 @@
         <w:jc w:val="both"/>
       </w:pPr>
       <w:r>
-        <w:t>Implementar el despliegue del sistema de información web en un entorno de producción, asegurando que todas las funcionalidades estén completamente operativas y sean accesibles para los usuarios de la academia "New Goal English" C.A.</w:t>
+        <w:t>Implementar el despliegue del sistema de información web en un entorno de producción, asegurando que todas las funcionalidades estén completamente operativas y sean accesibles para los usuarios de la academia "New Goal English C.A.</w:t>
+      </w:r>
+      <w:r>
+        <w:t>”.</w:t>
       </w:r>
     </w:p>
     <w:p>
@@ -6197,7 +7916,7 @@
       <w:pPr>
         <w:pStyle w:val="Ttulo2"/>
       </w:pPr>
-      <w:bookmarkStart w:id="22" w:name="_Toc182761953"/>
+      <w:bookmarkStart w:id="22" w:name="_Toc184732093"/>
       <w:r>
         <w:t xml:space="preserve">1.18 </w:t>
       </w:r>
@@ -6261,7 +7980,7 @@
       <w:pPr>
         <w:pStyle w:val="Ttulo2"/>
       </w:pPr>
-      <w:bookmarkStart w:id="23" w:name="_Toc182761954"/>
+      <w:bookmarkStart w:id="23" w:name="_Toc184732094"/>
       <w:r>
         <w:lastRenderedPageBreak/>
         <w:t xml:space="preserve">1.19 </w:t>
@@ -6473,7 +8192,7 @@
       <w:pPr>
         <w:pStyle w:val="Ttulo2"/>
       </w:pPr>
-      <w:bookmarkStart w:id="24" w:name="_Toc182761955"/>
+      <w:bookmarkStart w:id="24" w:name="_Toc184732095"/>
       <w:r>
         <w:t xml:space="preserve">1.20 </w:t>
       </w:r>
@@ -6773,7 +8492,7 @@
           <w:bCs/>
         </w:rPr>
       </w:pPr>
-      <w:bookmarkStart w:id="25" w:name="_Toc182761956"/>
+      <w:bookmarkStart w:id="25" w:name="_Toc184732096"/>
       <w:r>
         <w:t>1.2</w:t>
       </w:r>
@@ -10095,7 +11814,7 @@
         <w:pStyle w:val="Ttulo2"/>
         <w:ind w:firstLine="0"/>
       </w:pPr>
-      <w:bookmarkStart w:id="26" w:name="_Toc182761957"/>
+      <w:bookmarkStart w:id="26" w:name="_Toc184732097"/>
       <w:r>
         <w:lastRenderedPageBreak/>
         <w:t>1.22 Cronograma de actividades</w:t>
@@ -19755,7 +21474,7 @@
       <w:pPr>
         <w:pStyle w:val="Ttulo1"/>
       </w:pPr>
-      <w:bookmarkStart w:id="27" w:name="_Toc182761958"/>
+      <w:bookmarkStart w:id="27" w:name="_Toc184732098"/>
       <w:r>
         <w:t>Capítulo II</w:t>
       </w:r>
@@ -19768,9 +21487,11 @@
       <w:pPr>
         <w:pStyle w:val="Ttulo1"/>
       </w:pPr>
+      <w:bookmarkStart w:id="28" w:name="_Toc184732099"/>
       <w:r>
         <w:t>Marco Teórico</w:t>
       </w:r>
+      <w:bookmarkEnd w:id="28"/>
     </w:p>
     <w:p/>
     <w:p/>
@@ -19778,9 +21499,11 @@
       <w:pPr>
         <w:pStyle w:val="Ttulo2"/>
       </w:pPr>
+      <w:bookmarkStart w:id="29" w:name="_Toc184732100"/>
       <w:r>
         <w:t>2.1 Antecedentes de la investigación</w:t>
       </w:r>
+      <w:bookmarkEnd w:id="29"/>
     </w:p>
     <w:p/>
     <w:p>
@@ -19858,7 +21581,7 @@
       <w:pPr>
         <w:pStyle w:val="Ttulo2"/>
       </w:pPr>
-      <w:bookmarkStart w:id="28" w:name="_Toc182761959"/>
+      <w:bookmarkStart w:id="30" w:name="_Toc184732101"/>
       <w:r>
         <w:t>2.</w:t>
       </w:r>
@@ -19871,7 +21594,7 @@
       <w:r>
         <w:t>Bases Teóricas</w:t>
       </w:r>
-      <w:bookmarkEnd w:id="28"/>
+      <w:bookmarkEnd w:id="30"/>
     </w:p>
     <w:p/>
     <w:p>
@@ -20278,8 +22001,13 @@
       <w:pPr>
         <w:pStyle w:val="Ttulo3"/>
       </w:pPr>
-      <w:r>
-        <w:t xml:space="preserve">Tecnologías Empleadas </w:t>
+      <w:bookmarkStart w:id="31" w:name="_Toc184732102"/>
+      <w:r>
+        <w:t>Tecnologías Empleadas</w:t>
+      </w:r>
+      <w:bookmarkEnd w:id="31"/>
+      <w:r>
+        <w:t xml:space="preserve"> </w:t>
       </w:r>
     </w:p>
     <w:p>
@@ -20295,9 +22023,11 @@
       <w:pPr>
         <w:pStyle w:val="Ttulo3"/>
       </w:pPr>
+      <w:bookmarkStart w:id="32" w:name="_Toc184732103"/>
       <w:r>
         <w:t>JavaScript: El Lenguaje Versátil de la Web Moderna</w:t>
       </w:r>
+      <w:bookmarkEnd w:id="32"/>
     </w:p>
     <w:p/>
     <w:p>
@@ -20435,9 +22165,11 @@
       <w:pPr>
         <w:pStyle w:val="Ttulo3"/>
       </w:pPr>
+      <w:bookmarkStart w:id="33" w:name="_Toc184732104"/>
       <w:r>
         <w:t>PostgreSQL</w:t>
       </w:r>
+      <w:bookmarkEnd w:id="33"/>
     </w:p>
     <w:p/>
     <w:p>
@@ -20636,22 +22368,226 @@
     </w:p>
     <w:p>
       <w:pPr>
-        <w:pStyle w:val="APA"/>
-      </w:pPr>
-    </w:p>
-    <w:p>
-      <w:pPr>
-        <w:pStyle w:val="APA"/>
-      </w:pPr>
+        <w:rPr>
+          <w:rFonts w:ascii="Arial" w:hAnsi="Arial"/>
+        </w:rPr>
+      </w:pPr>
+      <w:r>
+        <w:br w:type="page"/>
+      </w:r>
     </w:p>
     <w:p>
       <w:pPr>
         <w:pStyle w:val="Ttulo3"/>
       </w:pPr>
+      <w:r>
+        <w:lastRenderedPageBreak/>
+        <w:t>Express</w:t>
+      </w:r>
+    </w:p>
+    <w:p/>
+    <w:p>
+      <w:pPr>
+        <w:pStyle w:val="APA"/>
+        <w:jc w:val="both"/>
+      </w:pPr>
+      <w:r>
+        <w:t xml:space="preserve">Express es uno de los </w:t>
+      </w:r>
+      <w:proofErr w:type="spellStart"/>
+      <w:r>
+        <w:t>frameworks</w:t>
+      </w:r>
+      <w:proofErr w:type="spellEnd"/>
+      <w:r>
+        <w:t xml:space="preserve"> más populares y versátiles en el ecosistema de Node.js. Diseñado como una herramienta ligera y flexible, Express permite a los desarrolladores construir aplicaciones web y </w:t>
+      </w:r>
+      <w:proofErr w:type="spellStart"/>
+      <w:r>
+        <w:t>APIs</w:t>
+      </w:r>
+      <w:proofErr w:type="spellEnd"/>
+      <w:r>
+        <w:t xml:space="preserve"> con rapidez y eficiencia. Este marco, lanzado inicialmente en 2010, ha ganado prominencia por su simplicidad y su capacidad de adaptarse a proyectos de diversa escala y complejidad.</w:t>
+      </w:r>
+    </w:p>
+    <w:p>
+      <w:pPr>
+        <w:pStyle w:val="APA"/>
+        <w:jc w:val="both"/>
+      </w:pPr>
+    </w:p>
+    <w:p>
+      <w:pPr>
+        <w:pStyle w:val="APA"/>
+        <w:jc w:val="both"/>
+        <w:rPr>
+          <w:b/>
+          <w:bCs/>
+        </w:rPr>
+      </w:pPr>
+      <w:r>
+        <w:rPr>
+          <w:b/>
+          <w:bCs/>
+        </w:rPr>
+        <w:t>Características Destacadas de Express</w:t>
+      </w:r>
+    </w:p>
+    <w:p>
+      <w:pPr>
+        <w:pStyle w:val="APA"/>
+        <w:jc w:val="both"/>
+      </w:pPr>
+      <w:r>
+        <w:t xml:space="preserve">Entre las características más notables de Express se encuentra su enfoque minimalista. A diferencia de otros </w:t>
+      </w:r>
+      <w:proofErr w:type="spellStart"/>
+      <w:r>
+        <w:t>frameworks</w:t>
+      </w:r>
+      <w:proofErr w:type="spellEnd"/>
+      <w:r>
+        <w:t xml:space="preserve"> más pesados, Express no impone una estructura rígida, lo que permite a los desarrolladores tomar decisiones sobre la organización y las herramientas adicionales que desean emplear. Este enfoque lo convierte en una opción ideal para proyectos personalizados.</w:t>
+      </w:r>
+    </w:p>
+    <w:p>
+      <w:pPr>
+        <w:pStyle w:val="APA"/>
+        <w:jc w:val="both"/>
+      </w:pPr>
+      <w:r>
+        <w:t>Otra característica clave es su extensibilidad. Gracias a un ecosistema rico de middleware, Express puede integrarse fácilmente con otras herramientas y librerías. Estos middlewares actúan como intermediarios entre las solicitudes y las respuestas, permitiendo funciones como autenticación, manejo de errores, compresión de datos y registro de actividades.</w:t>
+      </w:r>
+    </w:p>
+    <w:p>
+      <w:pPr>
+        <w:pStyle w:val="APA"/>
+        <w:jc w:val="both"/>
+      </w:pPr>
+      <w:r>
+        <w:t>Express también destaca por su capacidad de enrutamiento eficiente. Con una sintaxis sencilla y clara, los desarrolladores pueden definir rutas para manejar solicitudes HTTP (GET, POST, PUT, DELETE, etc.) y parametrizarlas para gestionar dinámicamente diferentes tipos de datos.</w:t>
+      </w:r>
+    </w:p>
+    <w:p>
+      <w:pPr>
+        <w:pStyle w:val="APA"/>
+        <w:jc w:val="both"/>
+      </w:pPr>
+    </w:p>
+    <w:p>
+      <w:pPr>
+        <w:pStyle w:val="APA"/>
+        <w:jc w:val="both"/>
+      </w:pPr>
+    </w:p>
+    <w:p>
+      <w:pPr>
+        <w:pStyle w:val="APA"/>
+        <w:jc w:val="both"/>
+        <w:rPr>
+          <w:b/>
+          <w:bCs/>
+        </w:rPr>
+      </w:pPr>
+      <w:r>
+        <w:rPr>
+          <w:b/>
+          <w:bCs/>
+        </w:rPr>
+        <w:lastRenderedPageBreak/>
+        <w:t>Beneficios de Usar Express</w:t>
+      </w:r>
+    </w:p>
+    <w:p>
+      <w:pPr>
+        <w:pStyle w:val="APA"/>
+        <w:jc w:val="both"/>
+      </w:pPr>
+      <w:r>
+        <w:t>El uso de Express ofrece numerosos beneficios. En primer lugar, su simplicidad y flexibilidad lo convierten en una herramienta ideal tanto para desarrolladores novatos como para expertos. Su curva de aprendizaje es moderada, pero lo suficientemente accesible para quienes ya tienen conocimientos básicos de JavaScript y Node.js.</w:t>
+      </w:r>
+    </w:p>
+    <w:p>
+      <w:pPr>
+        <w:pStyle w:val="APA"/>
+        <w:jc w:val="both"/>
+      </w:pPr>
+      <w:r>
+        <w:t>Además, Express mejora significativamente la productividad en el desarrollo. Su diseño modular permite implementar rápidamente funciones específicas sin necesidad de desarrollar todo desde cero. Esto, sumado a su integración con herramientas como bases de datos (MongoDB, MySQL), motores de plantillas (</w:t>
+      </w:r>
+      <w:proofErr w:type="spellStart"/>
+      <w:r>
+        <w:t>Pug</w:t>
+      </w:r>
+      <w:proofErr w:type="spellEnd"/>
+      <w:r>
+        <w:t>, EJS) y sistemas de autenticación, acelera el proceso de construcción de aplicaciones robustas.</w:t>
+      </w:r>
+    </w:p>
+    <w:p>
+      <w:pPr>
+        <w:pStyle w:val="APA"/>
+        <w:jc w:val="both"/>
+      </w:pPr>
+      <w:r>
+        <w:t xml:space="preserve">Por último, la comunidad activa que respalda Express es un factor crucial. La abundancia de recursos, como documentación, tutoriales y paquetes disponibles en </w:t>
+      </w:r>
+      <w:proofErr w:type="spellStart"/>
+      <w:r>
+        <w:t>npm</w:t>
+      </w:r>
+      <w:proofErr w:type="spellEnd"/>
+      <w:r>
+        <w:t>, facilita la resolución de problemas y la incorporación de nuevas funcionalidades.</w:t>
+      </w:r>
+    </w:p>
+    <w:p>
+      <w:pPr>
+        <w:pStyle w:val="APA"/>
+        <w:jc w:val="both"/>
+      </w:pPr>
+      <w:r>
+        <w:t xml:space="preserve">Express es un pilar fundamental en el desarrollo web moderno basado en Node.js. Sus características destacadas, como el enrutamiento eficiente y la extensibilidad mediante middleware, junto con los beneficios de su simplicidad y soporte comunitario, lo convierten en una herramienta indispensable para construir aplicaciones web y </w:t>
+      </w:r>
+      <w:proofErr w:type="spellStart"/>
+      <w:r>
+        <w:t>APIs</w:t>
+      </w:r>
+      <w:proofErr w:type="spellEnd"/>
+      <w:r>
+        <w:t>. Su enfoque minimalista, combinado con su flexibilidad y escalabilidad, asegura que pueda adaptarse a las necesidades de proyectos pequeños y grandes por igual, consolidándolo como una elección preferida en el panorama del desarrollo web.</w:t>
+      </w:r>
+    </w:p>
+    <w:p>
+      <w:pPr>
+        <w:pStyle w:val="APA"/>
+        <w:jc w:val="both"/>
+      </w:pPr>
+    </w:p>
+    <w:p>
+      <w:pPr>
+        <w:pStyle w:val="APA"/>
+        <w:jc w:val="both"/>
+      </w:pPr>
+    </w:p>
+    <w:p>
+      <w:pPr>
+        <w:pStyle w:val="APA"/>
+        <w:jc w:val="both"/>
+      </w:pPr>
+    </w:p>
+    <w:p>
+      <w:pPr>
+        <w:pStyle w:val="Ttulo3"/>
+        <w:ind w:left="0" w:firstLine="708"/>
+      </w:pPr>
+      <w:bookmarkStart w:id="34" w:name="_Toc184732105"/>
       <w:r>
         <w:lastRenderedPageBreak/>
         <w:t>Node.js</w:t>
       </w:r>
+      <w:bookmarkEnd w:id="34"/>
     </w:p>
     <w:p>
       <w:pPr>
@@ -20800,9 +22736,11 @@
       <w:pPr>
         <w:pStyle w:val="Ttulo3"/>
       </w:pPr>
+      <w:bookmarkStart w:id="35" w:name="_Toc184732106"/>
       <w:r>
         <w:t>Vue.js</w:t>
       </w:r>
+      <w:bookmarkEnd w:id="35"/>
     </w:p>
     <w:p/>
     <w:p>
@@ -21012,9 +22950,11 @@
       <w:pPr>
         <w:pStyle w:val="Ttulo3"/>
       </w:pPr>
+      <w:bookmarkStart w:id="36" w:name="_Toc184732107"/>
       <w:r>
         <w:t>Vuetify.js</w:t>
       </w:r>
+      <w:bookmarkEnd w:id="36"/>
     </w:p>
     <w:p/>
     <w:p>
@@ -21026,7 +22966,10 @@
       </w:r>
       <w:proofErr w:type="spellStart"/>
       <w:r>
-        <w:t>Design</w:t>
+        <w:t>Desi</w:t>
+      </w:r>
+      <w:r>
+        <w:t>gn</w:t>
       </w:r>
       <w:proofErr w:type="spellEnd"/>
       <w:r>
@@ -21312,7 +23255,7 @@
       <w:pPr>
         <w:pStyle w:val="Ttulo2"/>
       </w:pPr>
-      <w:bookmarkStart w:id="29" w:name="_Toc182761960"/>
+      <w:bookmarkStart w:id="37" w:name="_Toc184732108"/>
       <w:r>
         <w:t>2.</w:t>
       </w:r>
@@ -21325,7 +23268,7 @@
       <w:r>
         <w:t>Bases Legales</w:t>
       </w:r>
-      <w:bookmarkEnd w:id="29"/>
+      <w:bookmarkEnd w:id="37"/>
     </w:p>
     <w:p/>
     <w:p>
@@ -21342,16 +23285,17 @@
       <w:pPr>
         <w:pStyle w:val="Ttulo3"/>
       </w:pPr>
-      <w:bookmarkStart w:id="30" w:name="_Toc182761961"/>
+      <w:bookmarkStart w:id="38" w:name="_Toc184732109"/>
       <w:r>
         <w:t>Constitución de la república bolivariana de Venezuela (1999)</w:t>
       </w:r>
-      <w:bookmarkEnd w:id="30"/>
+      <w:bookmarkEnd w:id="38"/>
     </w:p>
     <w:p/>
     <w:p>
       <w:pPr>
         <w:pStyle w:val="APA"/>
+        <w:ind w:left="720" w:firstLine="0"/>
         <w:jc w:val="both"/>
       </w:pPr>
       <w:r>
@@ -21375,6 +23319,7 @@
     <w:p>
       <w:pPr>
         <w:pStyle w:val="APA"/>
+        <w:ind w:left="720" w:firstLine="0"/>
         <w:jc w:val="both"/>
       </w:pPr>
       <w:r>
@@ -21404,6 +23349,7 @@
     <w:p>
       <w:pPr>
         <w:pStyle w:val="APA"/>
+        <w:ind w:left="720"/>
         <w:jc w:val="both"/>
       </w:pPr>
       <w:r>
@@ -21413,6 +23359,7 @@
     <w:p>
       <w:pPr>
         <w:pStyle w:val="APA"/>
+        <w:ind w:left="720"/>
         <w:jc w:val="both"/>
       </w:pPr>
       <w:r>
@@ -21421,22 +23368,32 @@
       <w:r>
         <w:t>Artículo 103: Toda persona tiene derecho a una educación integral, de calidad, permanente, en igualdad de condiciones y oportunidades, sin más limitaciones que las derivadas de sus aptitudes, vocación y aspiraciones</w:t>
       </w:r>
+      <w:r>
+        <w:t>.</w:t>
+      </w:r>
+    </w:p>
+    <w:p>
+      <w:pPr>
+        <w:pStyle w:val="APA"/>
+        <w:ind w:left="720"/>
+        <w:jc w:val="both"/>
+      </w:pPr>
     </w:p>
     <w:p>
       <w:pPr>
         <w:pStyle w:val="Ttulo3"/>
       </w:pPr>
-      <w:bookmarkStart w:id="31" w:name="_Toc182761962"/>
       <w:r>
         <w:t xml:space="preserve"> </w:t>
       </w:r>
+      <w:bookmarkStart w:id="39" w:name="_Toc184732110"/>
       <w:r>
         <w:t>L</w:t>
       </w:r>
       <w:r>
         <w:t>ey orgánica de ciencia Tecnología e innovación</w:t>
       </w:r>
-      <w:bookmarkEnd w:id="31"/>
+      <w:bookmarkEnd w:id="39"/>
     </w:p>
     <w:p>
       <w:pPr>
@@ -21449,13 +23406,18 @@
     <w:p>
       <w:pPr>
         <w:pStyle w:val="APA"/>
+        <w:ind w:left="720" w:firstLine="0"/>
         <w:jc w:val="both"/>
       </w:pPr>
       <w:r>
         <w:t xml:space="preserve">Artículo 1. Objeto de esta Ley. La presente Ley tiene por objeto desarrollar los principios orientadores que en materia de ciencia, tecnología e innovación y sus aplicaciones, establece la Constitución de la República Bolivariana de Venezuela, organizar el Sistema Nacional de Ciencia, Tecnología e Innovación, definir los lineamientos que orientarán las políticas y estrategias para la actividad científica, tecnológica, de innovación y sus aplicaciones, con la implantación de mecanismos institucionales y operativos para la promoción, estímulo y fomento de la </w:t>
       </w:r>
       <w:r>
-        <w:t>investigación científica, la apropiación social del conocimiento y la transferencia e innovación tecnológica, a fin de fomentar la capacidad para la generación, uso y circulación del conocimiento y de impulsar el</w:t>
+        <w:t xml:space="preserve">investigación científica, la apropiación social del conocimiento y la transferencia e innovación tecnológica, a fin de fomentar la capacidad </w:t>
+      </w:r>
+      <w:r>
+        <w:lastRenderedPageBreak/>
+        <w:t>para la generación, uso y circulación del conocimiento y de impulsar el</w:t>
       </w:r>
       <w:r>
         <w:t xml:space="preserve"> </w:t>
@@ -21467,10 +23429,10 @@
     <w:p>
       <w:pPr>
         <w:pStyle w:val="APA"/>
+        <w:ind w:left="720"/>
         <w:jc w:val="both"/>
       </w:pPr>
       <w:r>
-        <w:lastRenderedPageBreak/>
         <w:br/>
       </w:r>
       <w:r>
@@ -21480,6 +23442,7 @@
     <w:p>
       <w:pPr>
         <w:pStyle w:val="APA"/>
+        <w:ind w:left="720"/>
         <w:jc w:val="both"/>
       </w:pPr>
       <w:r>
@@ -21501,6 +23464,7 @@
     <w:p>
       <w:pPr>
         <w:pStyle w:val="APA"/>
+        <w:ind w:left="720" w:firstLine="0"/>
         <w:jc w:val="both"/>
       </w:pPr>
       <w:r>
@@ -21513,6 +23477,7 @@
     <w:p>
       <w:pPr>
         <w:pStyle w:val="APA"/>
+        <w:ind w:left="720" w:firstLine="0"/>
         <w:jc w:val="both"/>
       </w:pPr>
       <w:r>
@@ -21525,6 +23490,7 @@
     <w:p>
       <w:pPr>
         <w:pStyle w:val="APA"/>
+        <w:ind w:left="720" w:firstLine="0"/>
         <w:jc w:val="both"/>
       </w:pPr>
       <w:r>
@@ -21534,6 +23500,7 @@
     <w:p>
       <w:pPr>
         <w:pStyle w:val="APA"/>
+        <w:ind w:left="720" w:firstLine="0"/>
         <w:jc w:val="both"/>
       </w:pPr>
       <w:r>
@@ -21543,18 +23510,12 @@
     <w:p>
       <w:pPr>
         <w:pStyle w:val="APA"/>
+        <w:ind w:left="720" w:firstLine="0"/>
         <w:jc w:val="both"/>
       </w:pPr>
       <w:r>
         <w:t>5. Las personas públicas o privadas que realicen actividades de ciencia, tecnología, innovación y sus aplicaciones.</w:t>
       </w:r>
-    </w:p>
-    <w:p>
-      <w:pPr>
-        <w:rPr>
-          <w:rFonts w:ascii="Arial" w:hAnsi="Arial"/>
-        </w:rPr>
-      </w:pPr>
       <w:r>
         <w:br w:type="page"/>
       </w:r>
@@ -21563,27 +23524,36 @@
       <w:pPr>
         <w:pStyle w:val="Ttulo1"/>
       </w:pPr>
+      <w:bookmarkStart w:id="40" w:name="_Toc184732111"/>
       <w:r>
         <w:lastRenderedPageBreak/>
         <w:t>Capitulo III</w:t>
       </w:r>
+      <w:bookmarkEnd w:id="40"/>
     </w:p>
     <w:p>
       <w:pPr>
         <w:pStyle w:val="Ttulo1"/>
       </w:pPr>
       <w:r>
-        <w:t xml:space="preserve"> Marco Metodológico</w:t>
-      </w:r>
+        <w:t xml:space="preserve"> </w:t>
+      </w:r>
+      <w:bookmarkStart w:id="41" w:name="_Toc184732112"/>
+      <w:r>
+        <w:t>Marco Metodológico</w:t>
+      </w:r>
+      <w:bookmarkEnd w:id="41"/>
     </w:p>
     <w:p/>
     <w:p>
       <w:pPr>
         <w:pStyle w:val="Ttulo2"/>
       </w:pPr>
+      <w:bookmarkStart w:id="42" w:name="_Toc184732113"/>
       <w:r>
         <w:t>3.1 Tipo de investigación</w:t>
       </w:r>
+      <w:bookmarkEnd w:id="42"/>
     </w:p>
     <w:p/>
     <w:p>
@@ -21595,13 +23565,7 @@
         <w:tab/>
       </w:r>
       <w:r>
-        <w:t>Cuando se habla de tipo de investigación se "refiere al alcance que puede tener una investigación científica." (Hernández, y Otros. 1991.p.57)</w:t>
-      </w:r>
-      <w:r>
-        <w:t xml:space="preserve">.  </w:t>
-      </w:r>
-      <w:r>
-        <w:t>La investigación de campo, según Fidias Arias (2012), "consiste en la recolección de datos directamente del lugar donde ocurre el fenómeno de interés, con el fin de describirlo, analizarlo y proponer soluciones específicas". Este tipo de investigación se distingue por su enfoque empírico y su interacción directa con la realidad, lo que lo convierte en una herramienta indispensable cuando el problema estudiado está profundamente influido por su contexto natural.</w:t>
+        <w:t>Cuando se habla de tipo de investigación se "refiere al alcance que puede tener una investigación científica." (Hernández, y Otros. 1991.p.57).  La investigación de campo, según Fidias Arias (2012), "consiste en la recolección de datos directamente del lugar donde ocurre el fenómeno de interés, con el fin de describirlo, analizarlo y proponer soluciones específicas". Este tipo de investigación se distingue por su enfoque empírico y su interacción directa con la realidad, lo que lo convierte en una herramienta indispensable cuando el problema estudiado está profundamente influido por su contexto natural.</w:t>
       </w:r>
     </w:p>
     <w:p>
@@ -21694,18 +23658,22 @@
       <w:pPr>
         <w:pStyle w:val="Ttulo2"/>
       </w:pPr>
+      <w:bookmarkStart w:id="43" w:name="_Toc184732114"/>
       <w:r>
         <w:t>3.2 Técnicas e instrumentos de recolección de datos</w:t>
       </w:r>
+      <w:bookmarkEnd w:id="43"/>
     </w:p>
     <w:p/>
     <w:p>
       <w:pPr>
         <w:pStyle w:val="Ttulo2"/>
       </w:pPr>
+      <w:bookmarkStart w:id="44" w:name="_Toc184732115"/>
       <w:r>
         <w:t>3.3 Población y muestra</w:t>
       </w:r>
+      <w:bookmarkEnd w:id="44"/>
     </w:p>
     <w:p/>
     <w:p>
@@ -21715,12 +23683,14 @@
           <w:lang w:val="es-MX"/>
         </w:rPr>
       </w:pPr>
+      <w:bookmarkStart w:id="45" w:name="_Toc184732116"/>
       <w:r>
         <w:rPr>
           <w:lang w:val="es-MX"/>
         </w:rPr>
         <w:t>Población</w:t>
       </w:r>
+      <w:bookmarkEnd w:id="45"/>
     </w:p>
     <w:p>
       <w:pPr>
@@ -21758,12 +23728,14 @@
           <w:lang w:val="es-MX"/>
         </w:rPr>
       </w:pPr>
+      <w:bookmarkStart w:id="46" w:name="_Toc184732117"/>
       <w:r>
         <w:rPr>
           <w:lang w:val="es-MX"/>
         </w:rPr>
         <w:t>Muestra</w:t>
       </w:r>
+      <w:bookmarkEnd w:id="46"/>
     </w:p>
     <w:p>
       <w:pPr>
@@ -21829,9 +23801,11 @@
       <w:pPr>
         <w:pStyle w:val="Ttulo2"/>
       </w:pPr>
+      <w:bookmarkStart w:id="47" w:name="_Toc184732118"/>
       <w:r>
         <w:t>3.5 Metodología Aplicada</w:t>
       </w:r>
+      <w:bookmarkEnd w:id="47"/>
     </w:p>
     <w:p/>
     <w:p>
@@ -21857,12 +23831,14 @@
       <w:pPr>
         <w:pStyle w:val="Ttulo3"/>
       </w:pPr>
+      <w:bookmarkStart w:id="48" w:name="_Toc184732119"/>
       <w:r>
         <w:t xml:space="preserve">Metodología </w:t>
       </w:r>
       <w:r>
         <w:t>Ágil</w:t>
       </w:r>
+      <w:bookmarkEnd w:id="48"/>
     </w:p>
     <w:p/>
     <w:p>
@@ -21891,15 +23867,7 @@
           <w:color w:val="17494D"/>
           <w:shd w:val="clear" w:color="auto" w:fill="FFFFFF"/>
         </w:rPr>
-        <w:t>, a</w:t>
-      </w:r>
-      <w:r>
-        <w:rPr>
-          <w:rFonts w:cs="Arial"/>
-          <w:color w:val="17494D"/>
-          <w:shd w:val="clear" w:color="auto" w:fill="FFFFFF"/>
-        </w:rPr>
-        <w:t>sí, con cada etapa completada, ya se pueden entregar avances y se deja de lado la necesidad de esperar hasta el término del proyecto.</w:t>
+        <w:t>, así, con cada etapa completada, ya se pueden entregar avances y se deja de lado la necesidad de esperar hasta el término del proyecto.</w:t>
       </w:r>
       <w:r>
         <w:rPr>
@@ -21951,12 +23919,14 @@
           <w:shd w:val="clear" w:color="auto" w:fill="FFFFFF"/>
         </w:rPr>
       </w:pPr>
+      <w:bookmarkStart w:id="49" w:name="_Toc184732120"/>
       <w:r>
         <w:rPr>
           <w:shd w:val="clear" w:color="auto" w:fill="FFFFFF"/>
         </w:rPr>
         <w:t>Scrum</w:t>
       </w:r>
+      <w:bookmarkEnd w:id="49"/>
     </w:p>
     <w:p/>
     <w:p>
@@ -22003,10 +23973,7 @@
         <w:jc w:val="both"/>
       </w:pPr>
       <w:r>
-        <w:t xml:space="preserve">Un </w:t>
-      </w:r>
-      <w:r>
-        <w:t>marco de trabajo por el cual las personas pueden acometer problemas complejos adaptativos, a la vez que entregar productos del máximo valor posible productiva y creativamente. Scrum es:</w:t>
+        <w:t>Un marco de trabajo por el cual las personas pueden acometer problemas complejos adaptativos, a la vez que entregar productos del máximo valor posible productiva y creativamente. Scrum es:</w:t>
       </w:r>
     </w:p>
     <w:p>
@@ -22083,9 +24050,11 @@
       <w:pPr>
         <w:pStyle w:val="Ttulo3"/>
       </w:pPr>
+      <w:bookmarkStart w:id="50" w:name="_Toc184732121"/>
       <w:r>
         <w:t>El equipo Scrum</w:t>
       </w:r>
+      <w:bookmarkEnd w:id="50"/>
     </w:p>
     <w:p/>
     <w:p>
@@ -22109,9 +24078,11 @@
       <w:pPr>
         <w:pStyle w:val="Ttulo3"/>
       </w:pPr>
+      <w:bookmarkStart w:id="51" w:name="_Toc184732122"/>
       <w:r>
         <w:t>Product Owner (Dueño del Producto)</w:t>
       </w:r>
+      <w:bookmarkEnd w:id="51"/>
     </w:p>
     <w:p/>
     <w:p>
@@ -22242,10 +24213,7 @@
         <w:t>directora</w:t>
       </w:r>
       <w:r>
-        <w:t xml:space="preserve"> y tutora comunitaria</w:t>
-      </w:r>
-      <w:r>
-        <w:t xml:space="preserve"> de “New Goal English Academia C.A”</w:t>
+        <w:t xml:space="preserve"> y tutora comunitaria de “New Goal English Academia C.A”</w:t>
       </w:r>
     </w:p>
     <w:p>
@@ -22257,9 +24225,11 @@
       <w:pPr>
         <w:pStyle w:val="Ttulo3"/>
       </w:pPr>
+      <w:bookmarkStart w:id="52" w:name="_Toc184732123"/>
       <w:r>
         <w:t>Development Team (Equipo de desarrollo)</w:t>
       </w:r>
+      <w:bookmarkEnd w:id="52"/>
     </w:p>
     <w:p/>
     <w:p>
@@ -22267,19 +24237,14 @@
         <w:pStyle w:val="APA"/>
       </w:pPr>
       <w:r>
-        <w:t>En este rol los miembros del equipo se autogestionan y son multifuncionales, los mismos se encargarán del desarrollo e implementación de las funcionalidades del sistema de acuerdo al Product Backlog, “</w:t>
-      </w:r>
-      <w:r>
-        <w:t>Los Equipos de Desarrollo son estructurados y empoderados por la organización para organizar y gestionar su propio trabajo.</w:t>
-      </w:r>
-      <w:r>
-        <w:t xml:space="preserve">” </w:t>
+        <w:t xml:space="preserve">En este rol los miembros del equipo se autogestionan y son multifuncionales, los mismos se encargarán del desarrollo e implementación de las funcionalidades del sistema de acuerdo al Product Backlog, “Los Equipos de Desarrollo son estructurados y empoderados por la organización para organizar y gestionar su propio trabajo.” </w:t>
       </w:r>
       <w:sdt>
         <w:sdtPr>
           <w:id w:val="-1724433297"/>
           <w:citation/>
         </w:sdtPr>
+        <w:sdtEndPr/>
         <w:sdtContent>
           <w:r>
             <w:fldChar w:fldCharType="begin"/>
@@ -22314,9 +24279,11 @@
       <w:pPr>
         <w:pStyle w:val="Ttulo3"/>
       </w:pPr>
+      <w:bookmarkStart w:id="53" w:name="_Toc184732124"/>
       <w:r>
         <w:t>Scrum Master</w:t>
       </w:r>
+      <w:bookmarkEnd w:id="53"/>
     </w:p>
     <w:p/>
     <w:p>
@@ -22533,10 +24500,7 @@
         <w:jc w:val="both"/>
       </w:pPr>
       <w:r>
-        <w:t>Guiar al Equipo de Desarrollo en el entorno de organizaciones en las que Scrum aún no</w:t>
-      </w:r>
-      <w:r>
-        <w:t xml:space="preserve"> </w:t>
+        <w:t xml:space="preserve">Guiar al Equipo de Desarrollo en el entorno de organizaciones en las que Scrum aún no </w:t>
       </w:r>
       <w:r>
         <w:t xml:space="preserve">ha sido adoptado y entendido por completo. </w:t>
@@ -22560,9 +24524,11 @@
         <w:pStyle w:val="Ttulo3"/>
         <w:jc w:val="both"/>
       </w:pPr>
+      <w:bookmarkStart w:id="54" w:name="_Toc184732125"/>
       <w:r>
         <w:t>Eventos Scrum</w:t>
       </w:r>
+      <w:bookmarkEnd w:id="54"/>
     </w:p>
     <w:p>
       <w:pPr>
@@ -22574,13 +24540,7 @@
         <w:pStyle w:val="APA"/>
       </w:pPr>
       <w:r>
-        <w:t xml:space="preserve">Los eventos de scrum los definen </w:t>
-      </w:r>
-      <w:r>
-        <w:t>Schwaber &amp; Sutherland</w:t>
-      </w:r>
-      <w:r>
-        <w:t xml:space="preserve"> como:</w:t>
+        <w:t>Los eventos de scrum los definen Schwaber &amp; Sutherland como:</w:t>
       </w:r>
     </w:p>
     <w:p>
@@ -22608,9 +24568,11 @@
       <w:pPr>
         <w:pStyle w:val="Ttulo3"/>
       </w:pPr>
+      <w:bookmarkStart w:id="55" w:name="_Toc184732126"/>
       <w:r>
         <w:t>Sprint</w:t>
       </w:r>
+      <w:bookmarkEnd w:id="55"/>
     </w:p>
     <w:p/>
     <w:p>
@@ -22631,19 +24593,7 @@
         <w:t>y/</w:t>
       </w:r>
       <w:r>
-        <w:t xml:space="preserve">o más funcionalidades en un lapso de tiempo inamovibles, es decir no modificables una vez este establecida una fecha </w:t>
-      </w:r>
-      <w:r>
-        <w:t>límite</w:t>
-      </w:r>
-      <w:r>
-        <w:t xml:space="preserve"> esta no se </w:t>
-      </w:r>
-      <w:r>
-        <w:t>modificará</w:t>
-      </w:r>
-      <w:r>
-        <w:t xml:space="preserve">. </w:t>
+        <w:t xml:space="preserve">o más funcionalidades en un lapso de tiempo inamovibles, es decir no modificables una vez este establecida una fecha límite esta no se modificará. </w:t>
       </w:r>
       <w:r>
         <w:t>En el presente proyecto cada Sprint se toma como una iteración de 15 días. Este lapso de tiempo es durante el cual el equipo de trabajo desarrollará los requisitos acordados en el Product Backlog y los transforma en un Incremento.</w:t>
@@ -22655,13 +24605,7 @@
         <w:jc w:val="both"/>
       </w:pPr>
       <w:r>
-        <w:t xml:space="preserve">Sin embargo, a pesar de no poder ser modificados en cuanto a su fecha de entrega estos pueden ser cancelados tal y como dicen </w:t>
-      </w:r>
-      <w:r>
-        <w:t>Schwaber &amp; Sutherland</w:t>
-      </w:r>
-      <w:r>
-        <w:t xml:space="preserve">: </w:t>
+        <w:t xml:space="preserve">Sin embargo, a pesar de no poder ser modificados en cuanto a su fecha de entrega estos pueden ser cancelados tal y como dicen Schwaber &amp; Sutherland: </w:t>
       </w:r>
     </w:p>
     <w:p>
@@ -22674,6 +24618,516 @@
         <w:lastRenderedPageBreak/>
         <w:t>Un Sprint puede ser cancelado antes de que el bloque de tiempo llegue a su fin. Solo el Dueño de Producto tiene la autoridad para cancelar el Sprint, aunque puede hacerlo bajo la influencia de los interesados, del Equipo de Desarrollo o del Scrum Master.</w:t>
       </w:r>
+    </w:p>
+    <w:p>
+      <w:pPr>
+        <w:pStyle w:val="APA"/>
+        <w:ind w:left="720" w:firstLine="0"/>
+        <w:jc w:val="both"/>
+      </w:pPr>
+    </w:p>
+    <w:p>
+      <w:pPr>
+        <w:pStyle w:val="Ttulo3"/>
+      </w:pPr>
+      <w:r>
+        <w:t>Planificación del Sprint</w:t>
+      </w:r>
+    </w:p>
+    <w:p/>
+    <w:p>
+      <w:pPr>
+        <w:pStyle w:val="APA"/>
+        <w:ind w:left="720"/>
+        <w:jc w:val="both"/>
+      </w:pPr>
+      <w:r>
+        <w:t>La Planificación del Sprint es el evento que da inicio a cada ciclo de desarrollo. En esta reunión, el Equipo Scrum trabaja colaborativamente para establecer qué objetivos se lograrán en el Sprint. El proceso se divide en dos partes fundamentales: decidir qué se puede completar durante el Sprint y definir cómo se ejecutará ese trabajo.</w:t>
+      </w:r>
+    </w:p>
+    <w:p>
+      <w:pPr>
+        <w:pStyle w:val="APA"/>
+        <w:ind w:left="720"/>
+        <w:jc w:val="both"/>
+      </w:pPr>
+      <w:r>
+        <w:t>Este evento, liderado por el Dueño del Producto, empieza con la revisión de los elementos del Product Backlog más relevantes, conocidos como "listos" (</w:t>
+      </w:r>
+      <w:proofErr w:type="spellStart"/>
+      <w:r>
+        <w:t>ready</w:t>
+      </w:r>
+      <w:proofErr w:type="spellEnd"/>
+      <w:r>
+        <w:t>). El equipo selecciona aquellos elementos que puede transformar en un incremento terminado, estableciendo un Objetivo del Sprint que actuará como brújula durante el desarrollo. El Equipo de Desarrollo, de manera autoorganizada, elabora un plan detallado que incluye las tareas específicas necesarias para alcanzar ese objetivo. Este enfoque asegura que el equipo tenga una visión clara y factible del trabajo a realizar.</w:t>
+      </w:r>
+    </w:p>
+    <w:p>
+      <w:pPr>
+        <w:pStyle w:val="Ttulo3"/>
+      </w:pPr>
+      <w:r>
+        <w:t>Scrum Diario</w:t>
+      </w:r>
+    </w:p>
+    <w:p/>
+    <w:p>
+      <w:pPr>
+        <w:pStyle w:val="APA"/>
+        <w:ind w:left="720"/>
+        <w:jc w:val="both"/>
+      </w:pPr>
+      <w:r>
+        <w:t>El Scrum Diario, conocido también como Daily Scrum, es un evento breve pero poderoso que se realiza diariamente. En solo 15 minutos, los miembros del Equipo de Desarrollo sincronizan sus actividades y ajustan su enfoque para las siguientes 24 horas. Este evento permite inspeccionar el progreso hacia el Objetivo del Sprint y adaptar las estrategias según sea necesario.</w:t>
+      </w:r>
+    </w:p>
+    <w:p>
+      <w:pPr>
+        <w:pStyle w:val="APA"/>
+        <w:ind w:left="720"/>
+        <w:jc w:val="both"/>
+      </w:pPr>
+      <w:r>
+        <w:lastRenderedPageBreak/>
+        <w:t>El formato típico incluye tres preguntas clave: ¿Qué hice ayer para alcanzar el objetivo? ¿Qué haré hoy? ¿Hay algún impedimento en el camino? Estas reflexiones fomentan la comunicación efectiva y refuerzan el compromiso del equipo con los objetivos establecidos. Más allá de su brevedad, el Daily Scrum es fundamental para identificar y resolver problemas rápidamente, manteniendo al equipo en un camino alineado y eficiente.</w:t>
+      </w:r>
+    </w:p>
+    <w:p>
+      <w:pPr>
+        <w:pStyle w:val="Ttulo3"/>
+      </w:pPr>
+      <w:r>
+        <w:t>Revisión del Sprint</w:t>
+      </w:r>
+    </w:p>
+    <w:p/>
+    <w:p>
+      <w:pPr>
+        <w:pStyle w:val="APA"/>
+        <w:ind w:left="720"/>
+        <w:jc w:val="both"/>
+        <w:rPr>
+          <w:lang w:val="es-MX"/>
+        </w:rPr>
+      </w:pPr>
+      <w:r>
+        <w:t>Al concluir el Sprint, se lleva a cabo la Revisión del Sprint, un evento que permite evaluar el trabajo realizado y obtener retroalimentación de los interesados. A diferencia de otras reuniones técnicas, la revisión adopta un enfoque colaborativo e informal. Durante este evento, el equipo demuestra el incremento completado, discute los desafíos enfrentados y recopila sugerencias para futuros Sprints.</w:t>
+      </w:r>
+    </w:p>
+    <w:p>
+      <w:pPr>
+        <w:pStyle w:val="APA"/>
+        <w:ind w:left="720"/>
+        <w:jc w:val="both"/>
+      </w:pPr>
+      <w:r>
+        <w:t>Este evento no solo inspecciona el producto, sino que también permite actualizar la Lista del Producto (Product Backlog) con base en los comentarios obtenidos. Además, fomenta una conexión más fuerte entre el equipo y los interesados, asegurando que las prioridades estén alineadas con las necesidades del cliente.</w:t>
+      </w:r>
+    </w:p>
+    <w:p>
+      <w:pPr>
+        <w:pStyle w:val="APA"/>
+        <w:ind w:left="720" w:firstLine="0"/>
+        <w:jc w:val="both"/>
+      </w:pPr>
+      <w:r>
+        <w:t>La fuerza de Scrum radica en su estructura iterativa y adaptable, en la que eventos como la Planificación del Sprint, el Scrum Diario y la Revisión del Sprint actúan como engranajes esenciales para garantizar el éxito del equipo. Estos momentos de interacción fomentan la claridad, la colaboración y la mejora continua, pilares esenciales en cualquier entorno complejo. A través de estos eventos, Scrum no solo ayuda a entregar productos de valor, sino que también promueve una cultura de excelencia y aprendizaje constante.</w:t>
+      </w:r>
+    </w:p>
+    <w:p>
+      <w:pPr>
+        <w:pStyle w:val="APA"/>
+        <w:ind w:left="720" w:firstLine="0"/>
+        <w:jc w:val="both"/>
+      </w:pPr>
+    </w:p>
+    <w:p>
+      <w:pPr>
+        <w:pStyle w:val="Ttulo3"/>
+      </w:pPr>
+      <w:r>
+        <w:lastRenderedPageBreak/>
+        <w:t>Artefactos de Scrum</w:t>
+      </w:r>
+    </w:p>
+    <w:p/>
+    <w:p>
+      <w:pPr>
+        <w:pStyle w:val="APA"/>
+        <w:ind w:left="720"/>
+        <w:jc w:val="both"/>
+      </w:pPr>
+      <w:r>
+        <w:t xml:space="preserve">Los artefactos de Scrum son elementos esenciales que permiten la gestión transparente del progreso y la adaptación en proyectos. Estos representan trabajo o valor en diversas formas y están diseñados para maximizar la transparencia de la información clave, asegurando que todos los involucrados comprendan de manera uniforme el estado del proyecto. </w:t>
+      </w:r>
+    </w:p>
+    <w:p>
+      <w:pPr>
+        <w:pStyle w:val="APA"/>
+        <w:ind w:left="720"/>
+        <w:jc w:val="both"/>
+      </w:pPr>
+    </w:p>
+    <w:p>
+      <w:pPr>
+        <w:pStyle w:val="Ttulo3"/>
+      </w:pPr>
+      <w:r>
+        <w:t xml:space="preserve"> Product Backlog (Lista de Producto)</w:t>
+      </w:r>
+    </w:p>
+    <w:p/>
+    <w:p>
+      <w:pPr>
+        <w:pStyle w:val="APA"/>
+        <w:ind w:left="720"/>
+        <w:jc w:val="both"/>
+      </w:pPr>
+      <w:r>
+        <w:t>El Product Backlog constituye la base para la planificación y ejecución del proyecto. Es una lista ordenada y priorizada que incluye todas las funcionalidades, requisitos, mejoras y correcciones necesarias para el producto. Esta lista es gestionada exclusivamente por el Product Owner, quien asume la responsabilidad de su contenido, disponibilidad y orden.</w:t>
+      </w:r>
+    </w:p>
+    <w:p>
+      <w:pPr>
+        <w:pStyle w:val="APA"/>
+        <w:ind w:left="720"/>
+        <w:jc w:val="both"/>
+      </w:pPr>
+      <w:r>
+        <w:t>Características principales:</w:t>
+      </w:r>
+    </w:p>
+    <w:p>
+      <w:pPr>
+        <w:pStyle w:val="APA"/>
+        <w:ind w:left="720"/>
+        <w:jc w:val="both"/>
+      </w:pPr>
+      <w:r>
+        <w:t>Dinamismo: Este artefacto evoluciona constantemente para reflejar cambios en las condiciones del mercado, los requisitos del negocio o las necesidades del usuario.</w:t>
+      </w:r>
+    </w:p>
+    <w:p>
+      <w:pPr>
+        <w:pStyle w:val="APA"/>
+        <w:ind w:left="720"/>
+        <w:jc w:val="both"/>
+      </w:pPr>
+      <w:r>
+        <w:t>Refinamiento continuo: Los elementos de la lista se detallan, estiman y reorganizan en colaboración con el equipo de desarrollo. Este proceso ocupa aproximadamente el 10% de la capacidad del equipo.</w:t>
+      </w:r>
+    </w:p>
+    <w:p>
+      <w:pPr>
+        <w:pStyle w:val="APA"/>
+        <w:ind w:left="720"/>
+        <w:jc w:val="both"/>
+      </w:pPr>
+      <w:r>
+        <w:t>Granularidad: Los elementos se descomponen en tareas más específicas, asegurando que puedan completarse dentro de un Sprint.</w:t>
+      </w:r>
+    </w:p>
+    <w:p>
+      <w:pPr>
+        <w:pStyle w:val="APA"/>
+        <w:ind w:left="720"/>
+        <w:jc w:val="both"/>
+      </w:pPr>
+      <w:r>
+        <w:t>Relevancia en el proyecto:</w:t>
+      </w:r>
+    </w:p>
+    <w:p>
+      <w:pPr>
+        <w:pStyle w:val="APA"/>
+        <w:ind w:left="720"/>
+        <w:jc w:val="both"/>
+      </w:pPr>
+      <w:r>
+        <w:lastRenderedPageBreak/>
+        <w:t>El Product Backlog proporciona una visión clara y priorizada de las tareas necesarias, asegurando que todos los involucrados compartan una comprensión común sobre los objetivos y necesidades del producto.</w:t>
+      </w:r>
+    </w:p>
+    <w:p>
+      <w:pPr>
+        <w:pStyle w:val="Ttulo3"/>
+      </w:pPr>
+      <w:r>
+        <w:t>Sprint Backlog (Lista de Pendientes del Sprint)</w:t>
+      </w:r>
+    </w:p>
+    <w:p/>
+    <w:p>
+      <w:pPr>
+        <w:pStyle w:val="APA"/>
+        <w:ind w:left="720"/>
+        <w:jc w:val="both"/>
+      </w:pPr>
+      <w:r>
+        <w:t>El Sprint Backlog es una selección de elementos extraídos del Product Backlog que el equipo de desarrollo se compromete a completar durante un Sprint. Este incluye, además, un plan detallado que describe cómo se entregará el incremento de producto.</w:t>
+      </w:r>
+    </w:p>
+    <w:p>
+      <w:pPr>
+        <w:pStyle w:val="APA"/>
+        <w:ind w:left="720"/>
+        <w:jc w:val="both"/>
+      </w:pPr>
+      <w:r>
+        <w:t>Características principales:</w:t>
+      </w:r>
+    </w:p>
+    <w:p>
+      <w:pPr>
+        <w:pStyle w:val="APA"/>
+        <w:ind w:left="720"/>
+        <w:jc w:val="both"/>
+      </w:pPr>
+      <w:r>
+        <w:t>Propiedad exclusiva: Este artefacto pertenece únicamente al equipo de desarrollo, quien tiene la capacidad de modificarlo durante el Sprint.</w:t>
+      </w:r>
+    </w:p>
+    <w:p>
+      <w:pPr>
+        <w:pStyle w:val="APA"/>
+        <w:ind w:left="720"/>
+        <w:jc w:val="both"/>
+      </w:pPr>
+      <w:r>
+        <w:t>Emergente: A medida que se avanza en el Sprint, el equipo puede añadir tareas nuevas o ajustar las existentes, adaptándose a los desafíos que puedan surgir.</w:t>
+      </w:r>
+    </w:p>
+    <w:p>
+      <w:pPr>
+        <w:pStyle w:val="APA"/>
+        <w:ind w:left="720"/>
+        <w:jc w:val="both"/>
+      </w:pPr>
+      <w:r>
+        <w:t>Visibilidad: Es un reflejo en tiempo real del progreso hacia el objetivo del Sprint y sirve como base para las reuniones diarias.</w:t>
+      </w:r>
+    </w:p>
+    <w:p>
+      <w:pPr>
+        <w:pStyle w:val="APA"/>
+        <w:ind w:left="720"/>
+        <w:jc w:val="both"/>
+      </w:pPr>
+      <w:r>
+        <w:t>Impacto en el proyecto:</w:t>
+      </w:r>
+    </w:p>
+    <w:p>
+      <w:pPr>
+        <w:pStyle w:val="APA"/>
+        <w:ind w:left="720"/>
+        <w:jc w:val="both"/>
+      </w:pPr>
+      <w:r>
+        <w:t>El Sprint Backlog asegura que las tareas necesarias para cumplir los objetivos del Sprint estén claramente definidas, priorizadas y visibles para todo el equipo.</w:t>
+      </w:r>
+    </w:p>
+    <w:p>
+      <w:pPr>
+        <w:pStyle w:val="Ttulo3"/>
+      </w:pPr>
+      <w:r>
+        <w:t>Incremento</w:t>
+      </w:r>
+    </w:p>
+    <w:p/>
+    <w:p>
+      <w:pPr>
+        <w:pStyle w:val="APA"/>
+        <w:ind w:left="720"/>
+        <w:jc w:val="both"/>
+      </w:pPr>
+      <w:r>
+        <w:t>El Incremento es el resultado tangible de cada Sprint, que incluye los elementos del Product Backlog completados y validados. Este artefacto refleja el progreso acumulativo del proyecto, integrando tanto el valor de los Sprints anteriores como el nuevo valor generado.</w:t>
+      </w:r>
+    </w:p>
+    <w:p>
+      <w:pPr>
+        <w:pStyle w:val="APA"/>
+        <w:ind w:left="720"/>
+        <w:jc w:val="both"/>
+      </w:pPr>
+      <w:r>
+        <w:lastRenderedPageBreak/>
+        <w:t>Características principales:</w:t>
+      </w:r>
+    </w:p>
+    <w:p>
+      <w:pPr>
+        <w:pStyle w:val="APA"/>
+        <w:ind w:left="720"/>
+        <w:jc w:val="both"/>
+      </w:pPr>
+      <w:r>
+        <w:t>Listo para su uso: Al final de cada Sprint, el incremento debe estar completamente funcional y cumplir con la Definición de “Terminado” establecida por el equipo.</w:t>
+      </w:r>
+    </w:p>
+    <w:p>
+      <w:pPr>
+        <w:pStyle w:val="APA"/>
+        <w:ind w:left="720"/>
+        <w:jc w:val="both"/>
+      </w:pPr>
+      <w:r>
+        <w:t>Acumulativo: Representa el avance del proyecto, al ser la suma de todos los incrementos previos y actuales.</w:t>
+      </w:r>
+    </w:p>
+    <w:p>
+      <w:pPr>
+        <w:pStyle w:val="APA"/>
+        <w:ind w:left="720"/>
+        <w:jc w:val="both"/>
+      </w:pPr>
+      <w:r>
+        <w:t>Flexibilidad: Aunque siempre está listo para ser implementado, la decisión de liberarlo depende del Product Owner.</w:t>
+      </w:r>
+    </w:p>
+    <w:p>
+      <w:pPr>
+        <w:pStyle w:val="APA"/>
+        <w:ind w:left="720"/>
+        <w:jc w:val="both"/>
+      </w:pPr>
+      <w:r>
+        <w:t>Contribución al proyecto:</w:t>
+      </w:r>
+    </w:p>
+    <w:p>
+      <w:pPr>
+        <w:pStyle w:val="APA"/>
+        <w:ind w:left="720"/>
+        <w:jc w:val="both"/>
+      </w:pPr>
+      <w:r>
+        <w:t>El incremento garantiza que el equipo entregue valor continuamente, proporcionando resultados tangibles que pueden ser evaluados y utilizados para la retroalimentación.</w:t>
+      </w:r>
+    </w:p>
+    <w:p>
+      <w:pPr>
+        <w:pStyle w:val="Ttulo3"/>
+      </w:pPr>
+      <w:r>
+        <w:t>Planificación Estimada del Proyecto</w:t>
+      </w:r>
+    </w:p>
+    <w:p/>
+    <w:p>
+      <w:pPr>
+        <w:pStyle w:val="APA"/>
+        <w:ind w:left="720"/>
+        <w:jc w:val="both"/>
+      </w:pPr>
+      <w:r>
+        <w:t>La planificación en un proyecto Scrum no se basa en predicciones rígidas, sino en la evaluación empírica del progreso. Este enfoque permite una adaptación constante a medida que se adquiere conocimiento sobre el producto y el entorno.</w:t>
+      </w:r>
+    </w:p>
+    <w:p>
+      <w:pPr>
+        <w:pStyle w:val="APA"/>
+        <w:ind w:left="720"/>
+        <w:jc w:val="both"/>
+      </w:pPr>
+      <w:r>
+        <w:t>Etapas clave en la planificación:</w:t>
+      </w:r>
+    </w:p>
+    <w:p>
+      <w:pPr>
+        <w:pStyle w:val="APA"/>
+        <w:ind w:left="720"/>
+        <w:jc w:val="both"/>
+      </w:pPr>
+      <w:r>
+        <w:t>Definición del objetivo del producto: El equipo establece metas claras que guían el desarrollo.</w:t>
+      </w:r>
+    </w:p>
+    <w:p>
+      <w:pPr>
+        <w:pStyle w:val="APA"/>
+        <w:ind w:left="720"/>
+        <w:jc w:val="both"/>
+      </w:pPr>
+      <w:r>
+        <w:t>Refinamiento del Product Backlog: Se organizan y detallan los elementos para asegurar que sean accionables.</w:t>
+      </w:r>
+    </w:p>
+    <w:p>
+      <w:pPr>
+        <w:pStyle w:val="APA"/>
+        <w:ind w:left="720"/>
+        <w:jc w:val="both"/>
+      </w:pPr>
+      <w:r>
+        <w:t>Estimación del esfuerzo: El equipo de desarrollo calcula el tiempo y los recursos necesarios para completar cada tarea.</w:t>
+      </w:r>
+    </w:p>
+    <w:p>
+      <w:pPr>
+        <w:pStyle w:val="APA"/>
+        <w:ind w:left="720"/>
+        <w:jc w:val="both"/>
+      </w:pPr>
+      <w:r>
+        <w:lastRenderedPageBreak/>
+        <w:t>Seguimiento del progreso: Se utilizan herramientas como gráficos de trabajo pendiente (</w:t>
+      </w:r>
+      <w:proofErr w:type="spellStart"/>
+      <w:r>
+        <w:t>burndown</w:t>
+      </w:r>
+      <w:proofErr w:type="spellEnd"/>
+      <w:r>
+        <w:t>), trabajo avanzado (</w:t>
+      </w:r>
+      <w:proofErr w:type="spellStart"/>
+      <w:r>
+        <w:t>burnup</w:t>
+      </w:r>
+      <w:proofErr w:type="spellEnd"/>
+      <w:r>
+        <w:t xml:space="preserve">) y flujo acumulado (cumulative </w:t>
+      </w:r>
+      <w:proofErr w:type="spellStart"/>
+      <w:r>
+        <w:t>flow</w:t>
+      </w:r>
+      <w:proofErr w:type="spellEnd"/>
+      <w:r>
+        <w:t>) para monitorear y proyectar el avance.</w:t>
+      </w:r>
+    </w:p>
+    <w:p>
+      <w:pPr>
+        <w:pStyle w:val="APA"/>
+        <w:ind w:left="720"/>
+        <w:jc w:val="both"/>
+      </w:pPr>
+      <w:r>
+        <w:t>Enfoque ágil en el proyecto:</w:t>
+      </w:r>
+    </w:p>
+    <w:p>
+      <w:pPr>
+        <w:pStyle w:val="APA"/>
+        <w:ind w:left="720" w:firstLine="0"/>
+        <w:jc w:val="both"/>
+      </w:pPr>
+      <w:r>
+        <w:t>La planificación se adapta continuamente, reconociendo que en un entorno dinámico es imposible prever todos los resultados. El progreso se evalúa en función de los resultados reales, permitiendo decisiones informadas para los siguientes pasos.</w:t>
+      </w:r>
+    </w:p>
+    <w:p>
+      <w:pPr>
+        <w:pStyle w:val="APA"/>
+        <w:ind w:firstLine="0"/>
+        <w:jc w:val="both"/>
+      </w:pPr>
     </w:p>
     <w:p>
       <w:pPr>
@@ -27909,6 +30363,7 @@
   <w:style w:type="character" w:default="1" w:styleId="Fuentedeprrafopredeter">
     <w:name w:val="Default Paragraph Font"/>
     <w:uiPriority w:val="1"/>
+    <w:semiHidden/>
     <w:unhideWhenUsed/>
   </w:style>
   <w:style w:type="table" w:default="1" w:styleId="Tablanormal">

</xml_diff>